<commit_message>
add controller and orm
</commit_message>
<xml_diff>
--- a/src/Database/Query/Query.docx
+++ b/src/Database/Query/Query.docx
@@ -2475,6 +2475,35 @@
       </w:r>
     </w:p>
     <w:p>
+      <w:pPr>
+        <w:rPr>
+          <w:b/>
+          <w:bCs/>
+        </w:rPr>
+      </w:pPr>
+      <w:r>
+        <w:rPr>
+          <w:b/>
+          <w:bCs/>
+        </w:rPr>
+        <w:t>CROSS JOIN</w:t>
+      </w:r>
+    </w:p>
+    <w:p>
+      <w:r>
+        <w:t>T</w:t>
+      </w:r>
+      <w:r>
+        <w:t xml:space="preserve">ạo ra một tích Đề-các (Cartesian product) của hai bảng. Nó kết hợp mỗi hàng của bảng thứ nhất với mỗi hàng của bảng thứ hai. </w:t>
+      </w:r>
+      <w:r>
+        <w:t xml:space="preserve">Dùng </w:t>
+      </w:r>
+      <w:r>
+        <w:t>khi bạn muốn tạo ra một tập hợp kết quả với mọi khả năng có thể.</w:t>
+      </w:r>
+    </w:p>
+    <w:p>
       <w:r>
         <w:br/>
         <w:t xml:space="preserve">+ </w:t>
@@ -2515,6 +2544,10 @@
       </w:r>
       <w:proofErr w:type="gramStart"/>
       <w:r>
+        <w:rPr>
+          <w:b/>
+          <w:bCs/>
+        </w:rPr>
         <w:t>WHERE</w:t>
       </w:r>
       <w:proofErr w:type="gramEnd"/>
@@ -3076,7 +3109,14 @@
     </w:p>
     <w:p>
       <w:r>
-        <w:t>Subquery trong mệnh đề FROM</w:t>
+        <w:t xml:space="preserve">Subquery trong mệnh đề </w:t>
+      </w:r>
+      <w:r>
+        <w:rPr>
+          <w:b/>
+          <w:bCs/>
+        </w:rPr>
+        <w:t>FROM</w:t>
       </w:r>
     </w:p>
     <w:p>
@@ -3350,6 +3390,7 @@
           <w:sz w:val="20"/>
           <w:szCs w:val="20"/>
         </w:rPr>
+        <w:lastRenderedPageBreak/>
         <w:tab/>
       </w:r>
       <w:r>
@@ -3889,7 +3930,6 @@
         <w:rPr>
           <w:noProof/>
         </w:rPr>
-        <w:lastRenderedPageBreak/>
         <w:drawing>
           <wp:inline distT="0" distB="0" distL="0" distR="0" wp14:anchorId="1CE92D5C" wp14:editId="16B6F95D">
             <wp:extent cx="2369820" cy="854689"/>
@@ -5126,8 +5166,28 @@
       </w:pPr>
     </w:p>
     <w:p>
-      <w:r>
-        <w:t>Subquery với EXISTS</w:t>
+      <w:pPr>
+        <w:rPr>
+          <w:b/>
+          <w:bCs/>
+        </w:rPr>
+      </w:pPr>
+      <w:r>
+        <w:t xml:space="preserve">Subquery với </w:t>
+      </w:r>
+      <w:r>
+        <w:rPr>
+          <w:b/>
+          <w:bCs/>
+        </w:rPr>
+        <w:t>EXISTS</w:t>
+      </w:r>
+      <w:r>
+        <w:rPr>
+          <w:b/>
+          <w:bCs/>
+        </w:rPr>
+        <w:t>, IN, NOT IN</w:t>
       </w:r>
     </w:p>
     <w:p>
@@ -5143,9 +5203,1042 @@
           <w:szCs w:val="20"/>
         </w:rPr>
       </w:pPr>
+      <w:r>
+        <w:rPr>
+          <w:rFonts w:ascii="Consolas" w:hAnsi="Consolas"/>
+          <w:b/>
+          <w:bCs/>
+          <w:color w:val="800000"/>
+          <w:sz w:val="20"/>
+          <w:szCs w:val="20"/>
+        </w:rPr>
+        <w:t>select</w:t>
+      </w:r>
+      <w:r>
+        <w:rPr>
+          <w:rFonts w:ascii="Consolas" w:hAnsi="Consolas"/>
+          <w:color w:val="000000"/>
+          <w:sz w:val="20"/>
+          <w:szCs w:val="20"/>
+        </w:rPr>
+        <w:t xml:space="preserve"> </w:t>
+      </w:r>
+      <w:proofErr w:type="gramStart"/>
+      <w:r>
+        <w:rPr>
+          <w:rFonts w:ascii="Consolas" w:hAnsi="Consolas"/>
+          <w:i/>
+          <w:iCs/>
+          <w:color w:val="8E00C6"/>
+          <w:sz w:val="20"/>
+          <w:szCs w:val="20"/>
+        </w:rPr>
+        <w:t>d</w:t>
+      </w:r>
+      <w:r>
+        <w:rPr>
+          <w:rFonts w:ascii="Consolas" w:hAnsi="Consolas"/>
+          <w:color w:val="000000"/>
+          <w:sz w:val="20"/>
+          <w:szCs w:val="20"/>
+        </w:rPr>
+        <w:t>.</w:t>
+      </w:r>
+      <w:r>
+        <w:rPr>
+          <w:rFonts w:ascii="Consolas" w:hAnsi="Consolas"/>
+          <w:color w:val="006464"/>
+          <w:sz w:val="20"/>
+          <w:szCs w:val="20"/>
+        </w:rPr>
+        <w:t>dept</w:t>
+      </w:r>
+      <w:proofErr w:type="gramEnd"/>
+      <w:r>
+        <w:rPr>
+          <w:rFonts w:ascii="Consolas" w:hAnsi="Consolas"/>
+          <w:color w:val="006464"/>
+          <w:sz w:val="20"/>
+          <w:szCs w:val="20"/>
+        </w:rPr>
+        <w:t>_name</w:t>
+      </w:r>
+      <w:r>
+        <w:rPr>
+          <w:rFonts w:ascii="Consolas" w:hAnsi="Consolas"/>
+          <w:color w:val="000000"/>
+          <w:sz w:val="20"/>
+          <w:szCs w:val="20"/>
+        </w:rPr>
+        <w:t xml:space="preserve"> </w:t>
+      </w:r>
     </w:p>
     <w:p>
-      <w:r>
+      <w:pPr>
+        <w:pStyle w:val="NormalWeb"/>
+        <w:shd w:val="clear" w:color="auto" w:fill="FFFFFF"/>
+        <w:spacing w:before="0" w:beforeAutospacing="0" w:after="0" w:afterAutospacing="0"/>
+        <w:ind w:left="1440"/>
+        <w:rPr>
+          <w:rFonts w:ascii="Consolas" w:hAnsi="Consolas"/>
+          <w:color w:val="000000"/>
+          <w:sz w:val="20"/>
+          <w:szCs w:val="20"/>
+        </w:rPr>
+      </w:pPr>
+      <w:r>
+        <w:rPr>
+          <w:rFonts w:ascii="Consolas" w:hAnsi="Consolas"/>
+          <w:b/>
+          <w:bCs/>
+          <w:color w:val="800000"/>
+          <w:sz w:val="20"/>
+          <w:szCs w:val="20"/>
+        </w:rPr>
+        <w:t>from</w:t>
+      </w:r>
+      <w:r>
+        <w:rPr>
+          <w:rFonts w:ascii="Consolas" w:hAnsi="Consolas"/>
+          <w:color w:val="000000"/>
+          <w:sz w:val="20"/>
+          <w:szCs w:val="20"/>
+        </w:rPr>
+        <w:t xml:space="preserve"> </w:t>
+      </w:r>
+      <w:r>
+        <w:rPr>
+          <w:rFonts w:ascii="Consolas" w:hAnsi="Consolas"/>
+          <w:color w:val="8E00C6"/>
+          <w:sz w:val="20"/>
+          <w:szCs w:val="20"/>
+        </w:rPr>
+        <w:t>departments</w:t>
+      </w:r>
+      <w:r>
+        <w:rPr>
+          <w:rFonts w:ascii="Consolas" w:hAnsi="Consolas"/>
+          <w:color w:val="000000"/>
+          <w:sz w:val="20"/>
+          <w:szCs w:val="20"/>
+        </w:rPr>
+        <w:t xml:space="preserve"> </w:t>
+      </w:r>
+      <w:r>
+        <w:rPr>
+          <w:rFonts w:ascii="Consolas" w:hAnsi="Consolas"/>
+          <w:i/>
+          <w:iCs/>
+          <w:color w:val="8E00C6"/>
+          <w:sz w:val="20"/>
+          <w:szCs w:val="20"/>
+        </w:rPr>
+        <w:t>d</w:t>
+      </w:r>
+      <w:r>
+        <w:rPr>
+          <w:rFonts w:ascii="Consolas" w:hAnsi="Consolas"/>
+          <w:color w:val="000000"/>
+          <w:sz w:val="20"/>
+          <w:szCs w:val="20"/>
+        </w:rPr>
+        <w:t xml:space="preserve"> </w:t>
+      </w:r>
+    </w:p>
+    <w:p>
+      <w:pPr>
+        <w:pStyle w:val="NormalWeb"/>
+        <w:shd w:val="clear" w:color="auto" w:fill="FFFFFF"/>
+        <w:spacing w:before="0" w:beforeAutospacing="0" w:after="0" w:afterAutospacing="0"/>
+        <w:ind w:left="1440"/>
+        <w:rPr>
+          <w:rFonts w:ascii="Consolas" w:hAnsi="Consolas"/>
+          <w:color w:val="000000"/>
+          <w:sz w:val="20"/>
+          <w:szCs w:val="20"/>
+        </w:rPr>
+      </w:pPr>
+      <w:r>
+        <w:rPr>
+          <w:rFonts w:ascii="Consolas" w:hAnsi="Consolas"/>
+          <w:b/>
+          <w:bCs/>
+          <w:color w:val="800000"/>
+          <w:sz w:val="20"/>
+          <w:szCs w:val="20"/>
+        </w:rPr>
+        <w:t>where</w:t>
+      </w:r>
+      <w:r>
+        <w:rPr>
+          <w:rFonts w:ascii="Consolas" w:hAnsi="Consolas"/>
+          <w:color w:val="000000"/>
+          <w:sz w:val="20"/>
+          <w:szCs w:val="20"/>
+        </w:rPr>
+        <w:t xml:space="preserve"> </w:t>
+      </w:r>
+      <w:r>
+        <w:rPr>
+          <w:rFonts w:ascii="Consolas" w:hAnsi="Consolas"/>
+          <w:b/>
+          <w:bCs/>
+          <w:color w:val="800000"/>
+          <w:sz w:val="20"/>
+          <w:szCs w:val="20"/>
+        </w:rPr>
+        <w:t>exists</w:t>
+      </w:r>
+      <w:r>
+        <w:rPr>
+          <w:rFonts w:ascii="Consolas" w:hAnsi="Consolas"/>
+          <w:color w:val="000000"/>
+          <w:sz w:val="20"/>
+          <w:szCs w:val="20"/>
+        </w:rPr>
+        <w:t xml:space="preserve"> (</w:t>
+      </w:r>
+    </w:p>
+    <w:p>
+      <w:pPr>
+        <w:pStyle w:val="NormalWeb"/>
+        <w:shd w:val="clear" w:color="auto" w:fill="FFFFFF"/>
+        <w:spacing w:before="0" w:beforeAutospacing="0" w:after="0" w:afterAutospacing="0"/>
+        <w:ind w:left="1440"/>
+        <w:rPr>
+          <w:rFonts w:ascii="Consolas" w:hAnsi="Consolas"/>
+          <w:color w:val="000000"/>
+          <w:sz w:val="20"/>
+          <w:szCs w:val="20"/>
+        </w:rPr>
+      </w:pPr>
+      <w:r>
+        <w:rPr>
+          <w:rFonts w:ascii="Consolas" w:hAnsi="Consolas"/>
+          <w:color w:val="000000"/>
+          <w:sz w:val="20"/>
+          <w:szCs w:val="20"/>
+        </w:rPr>
+        <w:tab/>
+      </w:r>
+      <w:r>
+        <w:rPr>
+          <w:rFonts w:ascii="Consolas" w:hAnsi="Consolas"/>
+          <w:b/>
+          <w:bCs/>
+          <w:color w:val="800000"/>
+          <w:sz w:val="20"/>
+          <w:szCs w:val="20"/>
+        </w:rPr>
+        <w:t>select</w:t>
+      </w:r>
+      <w:r>
+        <w:rPr>
+          <w:rFonts w:ascii="Consolas" w:hAnsi="Consolas"/>
+          <w:color w:val="000000"/>
+          <w:sz w:val="20"/>
+          <w:szCs w:val="20"/>
+        </w:rPr>
+        <w:t xml:space="preserve"> </w:t>
+      </w:r>
+      <w:r>
+        <w:rPr>
+          <w:rFonts w:ascii="Consolas" w:hAnsi="Consolas"/>
+          <w:color w:val="0000FF"/>
+          <w:sz w:val="20"/>
+          <w:szCs w:val="20"/>
+        </w:rPr>
+        <w:t>1</w:t>
+      </w:r>
+      <w:r>
+        <w:rPr>
+          <w:rFonts w:ascii="Consolas" w:hAnsi="Consolas"/>
+          <w:color w:val="000000"/>
+          <w:sz w:val="20"/>
+          <w:szCs w:val="20"/>
+        </w:rPr>
+        <w:t xml:space="preserve"> </w:t>
+      </w:r>
+    </w:p>
+    <w:p>
+      <w:pPr>
+        <w:pStyle w:val="NormalWeb"/>
+        <w:shd w:val="clear" w:color="auto" w:fill="FFFFFF"/>
+        <w:spacing w:before="0" w:beforeAutospacing="0" w:after="0" w:afterAutospacing="0"/>
+        <w:ind w:left="1440"/>
+        <w:rPr>
+          <w:rFonts w:ascii="Consolas" w:hAnsi="Consolas"/>
+          <w:color w:val="000000"/>
+          <w:sz w:val="20"/>
+          <w:szCs w:val="20"/>
+        </w:rPr>
+      </w:pPr>
+      <w:r>
+        <w:rPr>
+          <w:rFonts w:ascii="Consolas" w:hAnsi="Consolas"/>
+          <w:color w:val="000000"/>
+          <w:sz w:val="20"/>
+          <w:szCs w:val="20"/>
+        </w:rPr>
+        <w:tab/>
+      </w:r>
+      <w:r>
+        <w:rPr>
+          <w:rFonts w:ascii="Consolas" w:hAnsi="Consolas"/>
+          <w:b/>
+          <w:bCs/>
+          <w:color w:val="800000"/>
+          <w:sz w:val="20"/>
+          <w:szCs w:val="20"/>
+        </w:rPr>
+        <w:t>from</w:t>
+      </w:r>
+      <w:r>
+        <w:rPr>
+          <w:rFonts w:ascii="Consolas" w:hAnsi="Consolas"/>
+          <w:color w:val="000000"/>
+          <w:sz w:val="20"/>
+          <w:szCs w:val="20"/>
+        </w:rPr>
+        <w:t xml:space="preserve"> </w:t>
+      </w:r>
+      <w:r>
+        <w:rPr>
+          <w:rFonts w:ascii="Consolas" w:hAnsi="Consolas"/>
+          <w:color w:val="8E00C6"/>
+          <w:sz w:val="20"/>
+          <w:szCs w:val="20"/>
+        </w:rPr>
+        <w:t>employees</w:t>
+      </w:r>
+      <w:r>
+        <w:rPr>
+          <w:rFonts w:ascii="Consolas" w:hAnsi="Consolas"/>
+          <w:color w:val="000000"/>
+          <w:sz w:val="20"/>
+          <w:szCs w:val="20"/>
+        </w:rPr>
+        <w:t xml:space="preserve"> </w:t>
+      </w:r>
+      <w:r>
+        <w:rPr>
+          <w:rFonts w:ascii="Consolas" w:hAnsi="Consolas"/>
+          <w:i/>
+          <w:iCs/>
+          <w:color w:val="8E00C6"/>
+          <w:sz w:val="20"/>
+          <w:szCs w:val="20"/>
+        </w:rPr>
+        <w:t>e</w:t>
+      </w:r>
+      <w:r>
+        <w:rPr>
+          <w:rFonts w:ascii="Consolas" w:hAnsi="Consolas"/>
+          <w:color w:val="000000"/>
+          <w:sz w:val="20"/>
+          <w:szCs w:val="20"/>
+        </w:rPr>
+        <w:t xml:space="preserve"> </w:t>
+      </w:r>
+    </w:p>
+    <w:p>
+      <w:pPr>
+        <w:pStyle w:val="NormalWeb"/>
+        <w:shd w:val="clear" w:color="auto" w:fill="FFFFFF"/>
+        <w:spacing w:before="0" w:beforeAutospacing="0" w:after="0" w:afterAutospacing="0"/>
+        <w:ind w:left="1440"/>
+        <w:rPr>
+          <w:rFonts w:ascii="Consolas" w:hAnsi="Consolas"/>
+          <w:color w:val="000000"/>
+          <w:sz w:val="20"/>
+          <w:szCs w:val="20"/>
+        </w:rPr>
+      </w:pPr>
+      <w:r>
+        <w:rPr>
+          <w:rFonts w:ascii="Consolas" w:hAnsi="Consolas"/>
+          <w:color w:val="000000"/>
+          <w:sz w:val="20"/>
+          <w:szCs w:val="20"/>
+        </w:rPr>
+        <w:tab/>
+      </w:r>
+      <w:r>
+        <w:rPr>
+          <w:rFonts w:ascii="Consolas" w:hAnsi="Consolas"/>
+          <w:b/>
+          <w:bCs/>
+          <w:color w:val="800000"/>
+          <w:sz w:val="20"/>
+          <w:szCs w:val="20"/>
+        </w:rPr>
+        <w:t>where</w:t>
+      </w:r>
+      <w:r>
+        <w:rPr>
+          <w:rFonts w:ascii="Consolas" w:hAnsi="Consolas"/>
+          <w:color w:val="000000"/>
+          <w:sz w:val="20"/>
+          <w:szCs w:val="20"/>
+        </w:rPr>
+        <w:t xml:space="preserve"> </w:t>
+      </w:r>
+      <w:proofErr w:type="gramStart"/>
+      <w:r>
+        <w:rPr>
+          <w:rFonts w:ascii="Consolas" w:hAnsi="Consolas"/>
+          <w:i/>
+          <w:iCs/>
+          <w:color w:val="8E00C6"/>
+          <w:sz w:val="20"/>
+          <w:szCs w:val="20"/>
+        </w:rPr>
+        <w:t>e</w:t>
+      </w:r>
+      <w:r>
+        <w:rPr>
+          <w:rFonts w:ascii="Consolas" w:hAnsi="Consolas"/>
+          <w:color w:val="000000"/>
+          <w:sz w:val="20"/>
+          <w:szCs w:val="20"/>
+        </w:rPr>
+        <w:t>.</w:t>
+      </w:r>
+      <w:r>
+        <w:rPr>
+          <w:rFonts w:ascii="Consolas" w:hAnsi="Consolas"/>
+          <w:color w:val="006464"/>
+          <w:sz w:val="20"/>
+          <w:szCs w:val="20"/>
+        </w:rPr>
+        <w:t>dept</w:t>
+      </w:r>
+      <w:proofErr w:type="gramEnd"/>
+      <w:r>
+        <w:rPr>
+          <w:rFonts w:ascii="Consolas" w:hAnsi="Consolas"/>
+          <w:color w:val="006464"/>
+          <w:sz w:val="20"/>
+          <w:szCs w:val="20"/>
+        </w:rPr>
+        <w:t>_id</w:t>
+      </w:r>
+      <w:r>
+        <w:rPr>
+          <w:rFonts w:ascii="Consolas" w:hAnsi="Consolas"/>
+          <w:color w:val="000000"/>
+          <w:sz w:val="20"/>
+          <w:szCs w:val="20"/>
+        </w:rPr>
+        <w:t xml:space="preserve"> = </w:t>
+      </w:r>
+      <w:proofErr w:type="gramStart"/>
+      <w:r>
+        <w:rPr>
+          <w:rFonts w:ascii="Consolas" w:hAnsi="Consolas"/>
+          <w:i/>
+          <w:iCs/>
+          <w:color w:val="8E00C6"/>
+          <w:sz w:val="20"/>
+          <w:szCs w:val="20"/>
+        </w:rPr>
+        <w:t>d</w:t>
+      </w:r>
+      <w:r>
+        <w:rPr>
+          <w:rFonts w:ascii="Consolas" w:hAnsi="Consolas"/>
+          <w:color w:val="000000"/>
+          <w:sz w:val="20"/>
+          <w:szCs w:val="20"/>
+        </w:rPr>
+        <w:t>.</w:t>
+      </w:r>
+      <w:r>
+        <w:rPr>
+          <w:rFonts w:ascii="Consolas" w:hAnsi="Consolas"/>
+          <w:color w:val="006464"/>
+          <w:sz w:val="20"/>
+          <w:szCs w:val="20"/>
+        </w:rPr>
+        <w:t>dept</w:t>
+      </w:r>
+      <w:proofErr w:type="gramEnd"/>
+      <w:r>
+        <w:rPr>
+          <w:rFonts w:ascii="Consolas" w:hAnsi="Consolas"/>
+          <w:color w:val="006464"/>
+          <w:sz w:val="20"/>
+          <w:szCs w:val="20"/>
+        </w:rPr>
+        <w:t>_id</w:t>
+      </w:r>
+      <w:r>
+        <w:rPr>
+          <w:rFonts w:ascii="Consolas" w:hAnsi="Consolas"/>
+          <w:color w:val="000000"/>
+          <w:sz w:val="20"/>
+          <w:szCs w:val="20"/>
+        </w:rPr>
+        <w:t xml:space="preserve"> </w:t>
+      </w:r>
+    </w:p>
+    <w:p>
+      <w:pPr>
+        <w:pStyle w:val="NormalWeb"/>
+        <w:shd w:val="clear" w:color="auto" w:fill="FFFFFF"/>
+        <w:spacing w:before="0" w:beforeAutospacing="0" w:after="0" w:afterAutospacing="0"/>
+        <w:ind w:left="1440"/>
+        <w:rPr>
+          <w:rFonts w:ascii="Consolas" w:hAnsi="Consolas"/>
+          <w:color w:val="000000"/>
+          <w:sz w:val="20"/>
+          <w:szCs w:val="20"/>
+        </w:rPr>
+      </w:pPr>
+      <w:r>
+        <w:rPr>
+          <w:rFonts w:ascii="Consolas" w:hAnsi="Consolas"/>
+          <w:color w:val="000000"/>
+          <w:sz w:val="20"/>
+          <w:szCs w:val="20"/>
+        </w:rPr>
+        <w:t>)</w:t>
+      </w:r>
+    </w:p>
+    <w:p>
+      <w:pPr>
+        <w:pStyle w:val="NormalWeb"/>
+        <w:shd w:val="clear" w:color="auto" w:fill="FFFFFF"/>
+        <w:spacing w:before="0" w:beforeAutospacing="0" w:after="0" w:afterAutospacing="0"/>
+        <w:ind w:left="1440"/>
+        <w:rPr>
+          <w:rFonts w:ascii="Consolas" w:hAnsi="Consolas"/>
+          <w:color w:val="000000"/>
+          <w:sz w:val="20"/>
+          <w:szCs w:val="20"/>
+        </w:rPr>
+      </w:pPr>
+    </w:p>
+    <w:p/>
+    <w:p>
+      <w:pPr>
+        <w:pStyle w:val="NormalWeb"/>
+        <w:shd w:val="clear" w:color="auto" w:fill="FFFFFF"/>
+        <w:spacing w:before="0" w:beforeAutospacing="0" w:after="0" w:afterAutospacing="0"/>
+        <w:ind w:left="1440"/>
+        <w:rPr>
+          <w:rFonts w:ascii="Consolas" w:hAnsi="Consolas"/>
+          <w:color w:val="000000"/>
+          <w:sz w:val="20"/>
+          <w:szCs w:val="20"/>
+        </w:rPr>
+      </w:pPr>
+      <w:r>
+        <w:rPr>
+          <w:rFonts w:ascii="Consolas" w:hAnsi="Consolas"/>
+          <w:b/>
+          <w:bCs/>
+          <w:color w:val="800000"/>
+          <w:sz w:val="20"/>
+          <w:szCs w:val="20"/>
+        </w:rPr>
+        <w:t>select</w:t>
+      </w:r>
+      <w:r>
+        <w:rPr>
+          <w:rFonts w:ascii="Consolas" w:hAnsi="Consolas"/>
+          <w:color w:val="000000"/>
+          <w:sz w:val="20"/>
+          <w:szCs w:val="20"/>
+        </w:rPr>
+        <w:t xml:space="preserve"> </w:t>
+      </w:r>
+      <w:proofErr w:type="gramStart"/>
+      <w:r>
+        <w:rPr>
+          <w:rFonts w:ascii="Consolas" w:hAnsi="Consolas"/>
+          <w:i/>
+          <w:iCs/>
+          <w:color w:val="8E00C6"/>
+          <w:sz w:val="20"/>
+          <w:szCs w:val="20"/>
+        </w:rPr>
+        <w:t>d</w:t>
+      </w:r>
+      <w:r>
+        <w:rPr>
+          <w:rFonts w:ascii="Consolas" w:hAnsi="Consolas"/>
+          <w:color w:val="000000"/>
+          <w:sz w:val="20"/>
+          <w:szCs w:val="20"/>
+        </w:rPr>
+        <w:t>.</w:t>
+      </w:r>
+      <w:r>
+        <w:rPr>
+          <w:rFonts w:ascii="Consolas" w:hAnsi="Consolas"/>
+          <w:color w:val="006464"/>
+          <w:sz w:val="20"/>
+          <w:szCs w:val="20"/>
+        </w:rPr>
+        <w:t>dept</w:t>
+      </w:r>
+      <w:proofErr w:type="gramEnd"/>
+      <w:r>
+        <w:rPr>
+          <w:rFonts w:ascii="Consolas" w:hAnsi="Consolas"/>
+          <w:color w:val="006464"/>
+          <w:sz w:val="20"/>
+          <w:szCs w:val="20"/>
+        </w:rPr>
+        <w:t>_name</w:t>
+      </w:r>
+      <w:r>
+        <w:rPr>
+          <w:rFonts w:ascii="Consolas" w:hAnsi="Consolas"/>
+          <w:color w:val="000000"/>
+          <w:sz w:val="20"/>
+          <w:szCs w:val="20"/>
+        </w:rPr>
+        <w:t xml:space="preserve"> </w:t>
+      </w:r>
+    </w:p>
+    <w:p>
+      <w:pPr>
+        <w:pStyle w:val="NormalWeb"/>
+        <w:shd w:val="clear" w:color="auto" w:fill="FFFFFF"/>
+        <w:spacing w:before="0" w:beforeAutospacing="0" w:after="0" w:afterAutospacing="0"/>
+        <w:ind w:left="1440"/>
+        <w:rPr>
+          <w:rFonts w:ascii="Consolas" w:hAnsi="Consolas"/>
+          <w:color w:val="000000"/>
+          <w:sz w:val="20"/>
+          <w:szCs w:val="20"/>
+        </w:rPr>
+      </w:pPr>
+      <w:r>
+        <w:rPr>
+          <w:rFonts w:ascii="Consolas" w:hAnsi="Consolas"/>
+          <w:b/>
+          <w:bCs/>
+          <w:color w:val="800000"/>
+          <w:sz w:val="20"/>
+          <w:szCs w:val="20"/>
+        </w:rPr>
+        <w:t>from</w:t>
+      </w:r>
+      <w:r>
+        <w:rPr>
+          <w:rFonts w:ascii="Consolas" w:hAnsi="Consolas"/>
+          <w:color w:val="000000"/>
+          <w:sz w:val="20"/>
+          <w:szCs w:val="20"/>
+        </w:rPr>
+        <w:t xml:space="preserve"> </w:t>
+      </w:r>
+      <w:r>
+        <w:rPr>
+          <w:rFonts w:ascii="Consolas" w:hAnsi="Consolas"/>
+          <w:color w:val="8E00C6"/>
+          <w:sz w:val="20"/>
+          <w:szCs w:val="20"/>
+        </w:rPr>
+        <w:t>departments</w:t>
+      </w:r>
+      <w:r>
+        <w:rPr>
+          <w:rFonts w:ascii="Consolas" w:hAnsi="Consolas"/>
+          <w:color w:val="000000"/>
+          <w:sz w:val="20"/>
+          <w:szCs w:val="20"/>
+        </w:rPr>
+        <w:t xml:space="preserve"> </w:t>
+      </w:r>
+      <w:r>
+        <w:rPr>
+          <w:rFonts w:ascii="Consolas" w:hAnsi="Consolas"/>
+          <w:i/>
+          <w:iCs/>
+          <w:color w:val="8E00C6"/>
+          <w:sz w:val="20"/>
+          <w:szCs w:val="20"/>
+        </w:rPr>
+        <w:t>d</w:t>
+      </w:r>
+      <w:r>
+        <w:rPr>
+          <w:rFonts w:ascii="Consolas" w:hAnsi="Consolas"/>
+          <w:color w:val="000000"/>
+          <w:sz w:val="20"/>
+          <w:szCs w:val="20"/>
+        </w:rPr>
+        <w:t xml:space="preserve"> </w:t>
+      </w:r>
+    </w:p>
+    <w:p>
+      <w:pPr>
+        <w:pStyle w:val="NormalWeb"/>
+        <w:shd w:val="clear" w:color="auto" w:fill="FFFFFF"/>
+        <w:spacing w:before="0" w:beforeAutospacing="0" w:after="0" w:afterAutospacing="0"/>
+        <w:ind w:left="1440"/>
+        <w:rPr>
+          <w:rFonts w:ascii="Consolas" w:hAnsi="Consolas"/>
+          <w:color w:val="000000"/>
+          <w:sz w:val="20"/>
+          <w:szCs w:val="20"/>
+        </w:rPr>
+      </w:pPr>
+      <w:r>
+        <w:rPr>
+          <w:rFonts w:ascii="Consolas" w:hAnsi="Consolas"/>
+          <w:b/>
+          <w:bCs/>
+          <w:color w:val="800000"/>
+          <w:sz w:val="20"/>
+          <w:szCs w:val="20"/>
+        </w:rPr>
+        <w:t>where</w:t>
+      </w:r>
+      <w:r>
+        <w:rPr>
+          <w:rFonts w:ascii="Consolas" w:hAnsi="Consolas"/>
+          <w:color w:val="000000"/>
+          <w:sz w:val="20"/>
+          <w:szCs w:val="20"/>
+        </w:rPr>
+        <w:t xml:space="preserve"> </w:t>
+      </w:r>
+      <w:proofErr w:type="gramStart"/>
+      <w:r>
+        <w:rPr>
+          <w:rFonts w:ascii="Consolas" w:hAnsi="Consolas"/>
+          <w:i/>
+          <w:iCs/>
+          <w:color w:val="8E00C6"/>
+          <w:sz w:val="20"/>
+          <w:szCs w:val="20"/>
+        </w:rPr>
+        <w:t>d</w:t>
+      </w:r>
+      <w:r>
+        <w:rPr>
+          <w:rFonts w:ascii="Consolas" w:hAnsi="Consolas"/>
+          <w:color w:val="000000"/>
+          <w:sz w:val="20"/>
+          <w:szCs w:val="20"/>
+        </w:rPr>
+        <w:t>.</w:t>
+      </w:r>
+      <w:r>
+        <w:rPr>
+          <w:rFonts w:ascii="Consolas" w:hAnsi="Consolas"/>
+          <w:color w:val="006464"/>
+          <w:sz w:val="20"/>
+          <w:szCs w:val="20"/>
+        </w:rPr>
+        <w:t>dept</w:t>
+      </w:r>
+      <w:proofErr w:type="gramEnd"/>
+      <w:r>
+        <w:rPr>
+          <w:rFonts w:ascii="Consolas" w:hAnsi="Consolas"/>
+          <w:color w:val="006464"/>
+          <w:sz w:val="20"/>
+          <w:szCs w:val="20"/>
+        </w:rPr>
+        <w:t>_id</w:t>
+      </w:r>
+      <w:r>
+        <w:rPr>
+          <w:rFonts w:ascii="Consolas" w:hAnsi="Consolas"/>
+          <w:color w:val="000000"/>
+          <w:sz w:val="20"/>
+          <w:szCs w:val="20"/>
+        </w:rPr>
+        <w:t xml:space="preserve"> </w:t>
+      </w:r>
+      <w:r>
+        <w:rPr>
+          <w:rFonts w:ascii="Consolas" w:hAnsi="Consolas"/>
+          <w:b/>
+          <w:bCs/>
+          <w:color w:val="800000"/>
+          <w:sz w:val="20"/>
+          <w:szCs w:val="20"/>
+        </w:rPr>
+        <w:t>not</w:t>
+      </w:r>
+      <w:r>
+        <w:rPr>
+          <w:rFonts w:ascii="Consolas" w:hAnsi="Consolas"/>
+          <w:color w:val="000000"/>
+          <w:sz w:val="20"/>
+          <w:szCs w:val="20"/>
+        </w:rPr>
+        <w:t xml:space="preserve"> </w:t>
+      </w:r>
+      <w:r>
+        <w:rPr>
+          <w:rFonts w:ascii="Consolas" w:hAnsi="Consolas"/>
+          <w:b/>
+          <w:bCs/>
+          <w:color w:val="800000"/>
+          <w:sz w:val="20"/>
+          <w:szCs w:val="20"/>
+        </w:rPr>
+        <w:t>in</w:t>
+      </w:r>
+      <w:r>
+        <w:rPr>
+          <w:rFonts w:ascii="Consolas" w:hAnsi="Consolas"/>
+          <w:color w:val="000000"/>
+          <w:sz w:val="20"/>
+          <w:szCs w:val="20"/>
+        </w:rPr>
+        <w:t xml:space="preserve"> (</w:t>
+      </w:r>
+    </w:p>
+    <w:p>
+      <w:pPr>
+        <w:pStyle w:val="NormalWeb"/>
+        <w:shd w:val="clear" w:color="auto" w:fill="FFFFFF"/>
+        <w:spacing w:before="0" w:beforeAutospacing="0" w:after="0" w:afterAutospacing="0"/>
+        <w:ind w:left="1440"/>
+        <w:rPr>
+          <w:rFonts w:ascii="Consolas" w:hAnsi="Consolas"/>
+          <w:color w:val="000000"/>
+          <w:sz w:val="20"/>
+          <w:szCs w:val="20"/>
+        </w:rPr>
+      </w:pPr>
+      <w:r>
+        <w:rPr>
+          <w:rFonts w:ascii="Consolas" w:hAnsi="Consolas"/>
+          <w:color w:val="000000"/>
+          <w:sz w:val="20"/>
+          <w:szCs w:val="20"/>
+        </w:rPr>
+        <w:tab/>
+      </w:r>
+      <w:r>
+        <w:rPr>
+          <w:rFonts w:ascii="Consolas" w:hAnsi="Consolas"/>
+          <w:b/>
+          <w:bCs/>
+          <w:color w:val="800000"/>
+          <w:sz w:val="20"/>
+          <w:szCs w:val="20"/>
+        </w:rPr>
+        <w:t>select</w:t>
+      </w:r>
+      <w:r>
+        <w:rPr>
+          <w:rFonts w:ascii="Consolas" w:hAnsi="Consolas"/>
+          <w:color w:val="000000"/>
+          <w:sz w:val="20"/>
+          <w:szCs w:val="20"/>
+        </w:rPr>
+        <w:t xml:space="preserve"> </w:t>
+      </w:r>
+      <w:proofErr w:type="gramStart"/>
+      <w:r>
+        <w:rPr>
+          <w:rFonts w:ascii="Consolas" w:hAnsi="Consolas"/>
+          <w:i/>
+          <w:iCs/>
+          <w:color w:val="8E00C6"/>
+          <w:sz w:val="20"/>
+          <w:szCs w:val="20"/>
+        </w:rPr>
+        <w:t>e</w:t>
+      </w:r>
+      <w:r>
+        <w:rPr>
+          <w:rFonts w:ascii="Consolas" w:hAnsi="Consolas"/>
+          <w:color w:val="000000"/>
+          <w:sz w:val="20"/>
+          <w:szCs w:val="20"/>
+        </w:rPr>
+        <w:t>.</w:t>
+      </w:r>
+      <w:r>
+        <w:rPr>
+          <w:rFonts w:ascii="Consolas" w:hAnsi="Consolas"/>
+          <w:color w:val="006464"/>
+          <w:sz w:val="20"/>
+          <w:szCs w:val="20"/>
+        </w:rPr>
+        <w:t>dept</w:t>
+      </w:r>
+      <w:proofErr w:type="gramEnd"/>
+      <w:r>
+        <w:rPr>
+          <w:rFonts w:ascii="Consolas" w:hAnsi="Consolas"/>
+          <w:color w:val="006464"/>
+          <w:sz w:val="20"/>
+          <w:szCs w:val="20"/>
+        </w:rPr>
+        <w:t>_id</w:t>
+      </w:r>
+      <w:r>
+        <w:rPr>
+          <w:rFonts w:ascii="Consolas" w:hAnsi="Consolas"/>
+          <w:color w:val="000000"/>
+          <w:sz w:val="20"/>
+          <w:szCs w:val="20"/>
+        </w:rPr>
+        <w:t xml:space="preserve"> </w:t>
+      </w:r>
+    </w:p>
+    <w:p>
+      <w:pPr>
+        <w:pStyle w:val="NormalWeb"/>
+        <w:shd w:val="clear" w:color="auto" w:fill="FFFFFF"/>
+        <w:spacing w:before="0" w:beforeAutospacing="0" w:after="0" w:afterAutospacing="0"/>
+        <w:ind w:left="1440"/>
+        <w:rPr>
+          <w:rFonts w:ascii="Consolas" w:hAnsi="Consolas"/>
+          <w:color w:val="000000"/>
+          <w:sz w:val="20"/>
+          <w:szCs w:val="20"/>
+        </w:rPr>
+      </w:pPr>
+      <w:r>
+        <w:rPr>
+          <w:rFonts w:ascii="Consolas" w:hAnsi="Consolas"/>
+          <w:color w:val="000000"/>
+          <w:sz w:val="20"/>
+          <w:szCs w:val="20"/>
+        </w:rPr>
+        <w:tab/>
+      </w:r>
+      <w:r>
+        <w:rPr>
+          <w:rFonts w:ascii="Consolas" w:hAnsi="Consolas"/>
+          <w:b/>
+          <w:bCs/>
+          <w:color w:val="800000"/>
+          <w:sz w:val="20"/>
+          <w:szCs w:val="20"/>
+        </w:rPr>
+        <w:t>from</w:t>
+      </w:r>
+      <w:r>
+        <w:rPr>
+          <w:rFonts w:ascii="Consolas" w:hAnsi="Consolas"/>
+          <w:color w:val="000000"/>
+          <w:sz w:val="20"/>
+          <w:szCs w:val="20"/>
+        </w:rPr>
+        <w:t xml:space="preserve"> </w:t>
+      </w:r>
+      <w:r>
+        <w:rPr>
+          <w:rFonts w:ascii="Consolas" w:hAnsi="Consolas"/>
+          <w:color w:val="8E00C6"/>
+          <w:sz w:val="20"/>
+          <w:szCs w:val="20"/>
+        </w:rPr>
+        <w:t>employees</w:t>
+      </w:r>
+      <w:r>
+        <w:rPr>
+          <w:rFonts w:ascii="Consolas" w:hAnsi="Consolas"/>
+          <w:color w:val="000000"/>
+          <w:sz w:val="20"/>
+          <w:szCs w:val="20"/>
+        </w:rPr>
+        <w:t xml:space="preserve"> </w:t>
+      </w:r>
+      <w:r>
+        <w:rPr>
+          <w:rFonts w:ascii="Consolas" w:hAnsi="Consolas"/>
+          <w:i/>
+          <w:iCs/>
+          <w:color w:val="8E00C6"/>
+          <w:sz w:val="20"/>
+          <w:szCs w:val="20"/>
+        </w:rPr>
+        <w:t>e</w:t>
+      </w:r>
+      <w:r>
+        <w:rPr>
+          <w:rFonts w:ascii="Consolas" w:hAnsi="Consolas"/>
+          <w:color w:val="000000"/>
+          <w:sz w:val="20"/>
+          <w:szCs w:val="20"/>
+        </w:rPr>
+        <w:t xml:space="preserve"> </w:t>
+      </w:r>
+    </w:p>
+    <w:p>
+      <w:pPr>
+        <w:pStyle w:val="NormalWeb"/>
+        <w:shd w:val="clear" w:color="auto" w:fill="FFFFFF"/>
+        <w:spacing w:before="0" w:beforeAutospacing="0" w:after="0" w:afterAutospacing="0"/>
+        <w:ind w:left="1440"/>
+        <w:rPr>
+          <w:rFonts w:ascii="Consolas" w:hAnsi="Consolas"/>
+          <w:color w:val="000000"/>
+          <w:sz w:val="20"/>
+          <w:szCs w:val="20"/>
+        </w:rPr>
+      </w:pPr>
+      <w:r>
+        <w:rPr>
+          <w:rFonts w:ascii="Consolas" w:hAnsi="Consolas"/>
+          <w:color w:val="000000"/>
+          <w:sz w:val="20"/>
+          <w:szCs w:val="20"/>
+        </w:rPr>
+        <w:t>)</w:t>
+      </w:r>
+    </w:p>
+    <w:p>
+      <w:pPr>
+        <w:pStyle w:val="NormalWeb"/>
+        <w:shd w:val="clear" w:color="auto" w:fill="FFFFFF"/>
+        <w:spacing w:before="0" w:beforeAutospacing="0" w:after="0" w:afterAutospacing="0"/>
+        <w:ind w:left="1440"/>
+        <w:rPr>
+          <w:rFonts w:ascii="Consolas" w:hAnsi="Consolas"/>
+          <w:color w:val="000000"/>
+          <w:sz w:val="20"/>
+          <w:szCs w:val="20"/>
+        </w:rPr>
+      </w:pPr>
+    </w:p>
+    <w:p>
+      <w:pPr>
+        <w:pStyle w:val="NormalWeb"/>
+        <w:shd w:val="clear" w:color="auto" w:fill="FFFFFF"/>
+        <w:spacing w:before="0" w:beforeAutospacing="0" w:after="0" w:afterAutospacing="0"/>
+        <w:ind w:left="1440"/>
+        <w:rPr>
+          <w:rFonts w:ascii="Consolas" w:hAnsi="Consolas"/>
+          <w:color w:val="000000"/>
+          <w:sz w:val="20"/>
+          <w:szCs w:val="20"/>
+        </w:rPr>
+      </w:pPr>
+    </w:p>
+    <w:p>
+      <w:pPr>
+        <w:pStyle w:val="NormalWeb"/>
+        <w:shd w:val="clear" w:color="auto" w:fill="FFFFFF"/>
+        <w:spacing w:before="0" w:beforeAutospacing="0" w:after="0" w:afterAutospacing="0"/>
+        <w:ind w:left="1440"/>
+        <w:rPr>
+          <w:rFonts w:ascii="Consolas" w:hAnsi="Consolas"/>
+          <w:color w:val="000000"/>
+          <w:sz w:val="20"/>
+          <w:szCs w:val="20"/>
+        </w:rPr>
+      </w:pPr>
+    </w:p>
+    <w:p>
+      <w:r>
+        <w:lastRenderedPageBreak/>
         <w:br/>
         <w:t xml:space="preserve">+ </w:t>
       </w:r>
@@ -5859,7 +6952,6 @@
     </w:p>
     <w:p>
       <w:r>
-        <w:lastRenderedPageBreak/>
         <w:t>CTE thường được ưu tiên khi một truy vấn phức tạp và cần được chia thành các phần nhỏ hơn, dễ quản lý hơn, đồng thời nó cũng làm tăng khả năng sử dụng lại và giúp duy trì truy vấn. Trong khi subquery rất hữu ích khi truy vấn cần truy xuất dữ liệu cần thiết cho truy vấn bên ngoài.</w:t>
       </w:r>
     </w:p>
@@ -6335,7 +7427,11 @@
               <w:pStyle w:val="NoSpacing"/>
             </w:pPr>
             <w:r>
-              <w:t>Tùy thuộc vào trình tối ưu hóa truy vấn của database, thường tương đương hoặc tốt hơn subquery lồng.</w:t>
+              <w:t xml:space="preserve">Tùy thuộc vào trình tối ưu hóa truy vấn của database, thường </w:t>
+            </w:r>
+            <w:r>
+              <w:lastRenderedPageBreak/>
+              <w:t>tương đương hoặc tốt hơn subquery lồng.</w:t>
             </w:r>
           </w:p>
         </w:tc>
@@ -6356,6 +7452,7 @@
               <w:pStyle w:val="NoSpacing"/>
             </w:pPr>
             <w:r>
+              <w:lastRenderedPageBreak/>
               <w:t>Tùy thuộc vào trình tối ưu hóa. Subquery lồng sâu có thể kém hiệu quả.</w:t>
             </w:r>
           </w:p>
@@ -7103,7 +8200,6 @@
                 <w:sz w:val="20"/>
                 <w:szCs w:val="20"/>
               </w:rPr>
-              <w:lastRenderedPageBreak/>
               <w:t>10</w:t>
             </w:r>
           </w:p>
@@ -9684,6 +10780,7 @@
                 <w:sz w:val="20"/>
                 <w:szCs w:val="20"/>
               </w:rPr>
+              <w:lastRenderedPageBreak/>
               <w:t>30</w:t>
             </w:r>
           </w:p>
@@ -10172,7 +11269,6 @@
           <w:b/>
           <w:bCs/>
         </w:rPr>
-        <w:lastRenderedPageBreak/>
         <w:t>Cách hoạt động:</w:t>
       </w:r>
       <w:r>
@@ -11310,6 +12406,7 @@
               <w:pStyle w:val="NoSpacing"/>
             </w:pPr>
             <w:r>
+              <w:lastRenderedPageBreak/>
               <w:t>10</w:t>
             </w:r>
           </w:p>
@@ -13040,7 +14137,6 @@
               <w:pStyle w:val="NoSpacing"/>
             </w:pPr>
             <w:r>
-              <w:lastRenderedPageBreak/>
               <w:t>30</w:t>
             </w:r>
           </w:p>
@@ -13449,6 +14545,7 @@
           <w:b/>
           <w:bCs/>
         </w:rPr>
+        <w:lastRenderedPageBreak/>
         <w:t>View</w:t>
       </w:r>
       <w:r>
@@ -14515,6 +15612,7 @@
           <w:b/>
           <w:bCs/>
         </w:rPr>
+        <w:lastRenderedPageBreak/>
         <w:t>Bảo mật:</w:t>
       </w:r>
       <w:r>
@@ -14695,7 +15793,6 @@
               <w:ind w:firstLine="0"/>
             </w:pPr>
             <w:r>
-              <w:lastRenderedPageBreak/>
               <w:t>Hiệu suất</w:t>
             </w:r>
           </w:p>

</xml_diff>

<commit_message>
add update profile, medical in project
</commit_message>
<xml_diff>
--- a/src/Database/Query/Query.docx
+++ b/src/Database/Query/Query.docx
@@ -263,13 +263,8 @@
         <w:t xml:space="preserve">2. </w:t>
       </w:r>
       <w:r>
-        <w:t xml:space="preserve">Tìm hiểu và lấy ví dụ </w:t>
-      </w:r>
-      <w:proofErr w:type="gramStart"/>
-      <w:r>
-        <w:t>về :</w:t>
-      </w:r>
-      <w:proofErr w:type="gramEnd"/>
+        <w:t>Tìm hiểu và lấy ví dụ về :</w:t>
+      </w:r>
     </w:p>
     <w:p>
       <w:r>
@@ -441,38 +436,17 @@
           <w:sz w:val="20"/>
           <w:szCs w:val="20"/>
         </w:rPr>
-        <w:t>emp_</w:t>
-      </w:r>
-      <w:proofErr w:type="gramStart"/>
-      <w:r>
-        <w:rPr>
-          <w:rFonts w:ascii="Consolas" w:hAnsi="Consolas"/>
-          <w:color w:val="006464"/>
-          <w:sz w:val="20"/>
-          <w:szCs w:val="20"/>
-        </w:rPr>
-        <w:t>name</w:t>
-      </w:r>
-      <w:r>
-        <w:rPr>
-          <w:rFonts w:ascii="Consolas" w:hAnsi="Consolas"/>
-          <w:color w:val="000000"/>
-          <w:sz w:val="20"/>
-          <w:szCs w:val="20"/>
-        </w:rPr>
-        <w:t xml:space="preserve"> ,</w:t>
-      </w:r>
-      <w:proofErr w:type="gramEnd"/>
-      <w:r>
-        <w:rPr>
-          <w:rFonts w:ascii="Consolas" w:hAnsi="Consolas"/>
-          <w:color w:val="000000"/>
-          <w:sz w:val="20"/>
-          <w:szCs w:val="20"/>
-        </w:rPr>
-        <w:t xml:space="preserve"> </w:t>
-      </w:r>
-      <w:proofErr w:type="gramStart"/>
+        <w:t>emp_name</w:t>
+      </w:r>
+      <w:r>
+        <w:rPr>
+          <w:rFonts w:ascii="Consolas" w:hAnsi="Consolas"/>
+          <w:color w:val="000000"/>
+          <w:sz w:val="20"/>
+          <w:szCs w:val="20"/>
+        </w:rPr>
+        <w:t xml:space="preserve"> , </w:t>
+      </w:r>
       <w:r>
         <w:rPr>
           <w:rFonts w:ascii="Consolas" w:hAnsi="Consolas"/>
@@ -500,17 +474,7 @@
           <w:sz w:val="20"/>
           <w:szCs w:val="20"/>
         </w:rPr>
-        <w:t>dept</w:t>
-      </w:r>
-      <w:proofErr w:type="gramEnd"/>
-      <w:r>
-        <w:rPr>
-          <w:rFonts w:ascii="Consolas" w:hAnsi="Consolas"/>
-          <w:color w:val="006464"/>
-          <w:sz w:val="20"/>
-          <w:szCs w:val="20"/>
-        </w:rPr>
-        <w:t>_name</w:t>
+        <w:t>dept_name</w:t>
       </w:r>
       <w:r>
         <w:rPr>
@@ -705,7 +669,6 @@
         </w:rPr>
         <w:t xml:space="preserve"> </w:t>
       </w:r>
-      <w:proofErr w:type="gramStart"/>
       <w:r>
         <w:rPr>
           <w:rFonts w:ascii="Consolas" w:hAnsi="Consolas"/>
@@ -733,17 +696,7 @@
           <w:sz w:val="20"/>
           <w:szCs w:val="20"/>
         </w:rPr>
-        <w:t>dept</w:t>
-      </w:r>
-      <w:proofErr w:type="gramEnd"/>
-      <w:r>
-        <w:rPr>
-          <w:rFonts w:ascii="Consolas" w:hAnsi="Consolas"/>
-          <w:color w:val="006464"/>
-          <w:sz w:val="20"/>
-          <w:szCs w:val="20"/>
-        </w:rPr>
-        <w:t>_id</w:t>
+        <w:t>dept_id</w:t>
       </w:r>
       <w:r>
         <w:rPr>
@@ -754,7 +707,6 @@
         </w:rPr>
         <w:t xml:space="preserve"> = </w:t>
       </w:r>
-      <w:proofErr w:type="gramStart"/>
       <w:r>
         <w:rPr>
           <w:rFonts w:ascii="Consolas" w:hAnsi="Consolas"/>
@@ -782,17 +734,7 @@
           <w:sz w:val="20"/>
           <w:szCs w:val="20"/>
         </w:rPr>
-        <w:t>dept</w:t>
-      </w:r>
-      <w:proofErr w:type="gramEnd"/>
-      <w:r>
-        <w:rPr>
-          <w:rFonts w:ascii="Consolas" w:hAnsi="Consolas"/>
-          <w:color w:val="006464"/>
-          <w:sz w:val="20"/>
-          <w:szCs w:val="20"/>
-        </w:rPr>
-        <w:t>_id</w:t>
+        <w:t>dept_id</w:t>
       </w:r>
       <w:r>
         <w:rPr>
@@ -997,38 +939,17 @@
           <w:sz w:val="20"/>
           <w:szCs w:val="20"/>
         </w:rPr>
-        <w:t>emp_</w:t>
-      </w:r>
-      <w:proofErr w:type="gramStart"/>
-      <w:r>
-        <w:rPr>
-          <w:rFonts w:ascii="Consolas" w:hAnsi="Consolas"/>
-          <w:color w:val="006464"/>
-          <w:sz w:val="20"/>
-          <w:szCs w:val="20"/>
-        </w:rPr>
-        <w:t>name</w:t>
-      </w:r>
-      <w:r>
-        <w:rPr>
-          <w:rFonts w:ascii="Consolas" w:hAnsi="Consolas"/>
-          <w:color w:val="000000"/>
-          <w:sz w:val="20"/>
-          <w:szCs w:val="20"/>
-        </w:rPr>
-        <w:t xml:space="preserve"> ,</w:t>
-      </w:r>
-      <w:proofErr w:type="gramEnd"/>
-      <w:r>
-        <w:rPr>
-          <w:rFonts w:ascii="Consolas" w:hAnsi="Consolas"/>
-          <w:color w:val="000000"/>
-          <w:sz w:val="20"/>
-          <w:szCs w:val="20"/>
-        </w:rPr>
-        <w:t xml:space="preserve"> </w:t>
-      </w:r>
-      <w:proofErr w:type="gramStart"/>
+        <w:t>emp_name</w:t>
+      </w:r>
+      <w:r>
+        <w:rPr>
+          <w:rFonts w:ascii="Consolas" w:hAnsi="Consolas"/>
+          <w:color w:val="000000"/>
+          <w:sz w:val="20"/>
+          <w:szCs w:val="20"/>
+        </w:rPr>
+        <w:t xml:space="preserve"> , </w:t>
+      </w:r>
       <w:r>
         <w:rPr>
           <w:rFonts w:ascii="Consolas" w:hAnsi="Consolas"/>
@@ -1056,17 +977,7 @@
           <w:sz w:val="20"/>
           <w:szCs w:val="20"/>
         </w:rPr>
-        <w:t>dept</w:t>
-      </w:r>
-      <w:proofErr w:type="gramEnd"/>
-      <w:r>
-        <w:rPr>
-          <w:rFonts w:ascii="Consolas" w:hAnsi="Consolas"/>
-          <w:color w:val="006464"/>
-          <w:sz w:val="20"/>
-          <w:szCs w:val="20"/>
-        </w:rPr>
-        <w:t>_name</w:t>
+        <w:t>dept_name</w:t>
       </w:r>
       <w:r>
         <w:rPr>
@@ -1261,7 +1172,6 @@
         </w:rPr>
         <w:t xml:space="preserve"> </w:t>
       </w:r>
-      <w:proofErr w:type="gramStart"/>
       <w:r>
         <w:rPr>
           <w:rFonts w:ascii="Consolas" w:hAnsi="Consolas"/>
@@ -1289,17 +1199,7 @@
           <w:sz w:val="20"/>
           <w:szCs w:val="20"/>
         </w:rPr>
-        <w:t>dept</w:t>
-      </w:r>
-      <w:proofErr w:type="gramEnd"/>
-      <w:r>
-        <w:rPr>
-          <w:rFonts w:ascii="Consolas" w:hAnsi="Consolas"/>
-          <w:color w:val="006464"/>
-          <w:sz w:val="20"/>
-          <w:szCs w:val="20"/>
-        </w:rPr>
-        <w:t>_id</w:t>
+        <w:t>dept_id</w:t>
       </w:r>
       <w:r>
         <w:rPr>
@@ -1310,7 +1210,6 @@
         </w:rPr>
         <w:t xml:space="preserve"> = </w:t>
       </w:r>
-      <w:proofErr w:type="gramStart"/>
       <w:r>
         <w:rPr>
           <w:rFonts w:ascii="Consolas" w:hAnsi="Consolas"/>
@@ -1338,17 +1237,7 @@
           <w:sz w:val="20"/>
           <w:szCs w:val="20"/>
         </w:rPr>
-        <w:t>dept</w:t>
-      </w:r>
-      <w:proofErr w:type="gramEnd"/>
-      <w:r>
-        <w:rPr>
-          <w:rFonts w:ascii="Consolas" w:hAnsi="Consolas"/>
-          <w:color w:val="006464"/>
-          <w:sz w:val="20"/>
-          <w:szCs w:val="20"/>
-        </w:rPr>
-        <w:t>_id</w:t>
+        <w:t>dept_id</w:t>
       </w:r>
       <w:r>
         <w:rPr>
@@ -1521,38 +1410,17 @@
           <w:sz w:val="20"/>
           <w:szCs w:val="20"/>
         </w:rPr>
-        <w:t>emp_</w:t>
-      </w:r>
-      <w:proofErr w:type="gramStart"/>
-      <w:r>
-        <w:rPr>
-          <w:rFonts w:ascii="Consolas" w:hAnsi="Consolas"/>
-          <w:color w:val="006464"/>
-          <w:sz w:val="20"/>
-          <w:szCs w:val="20"/>
-        </w:rPr>
-        <w:t>name</w:t>
-      </w:r>
-      <w:r>
-        <w:rPr>
-          <w:rFonts w:ascii="Consolas" w:hAnsi="Consolas"/>
-          <w:color w:val="000000"/>
-          <w:sz w:val="20"/>
-          <w:szCs w:val="20"/>
-        </w:rPr>
-        <w:t xml:space="preserve"> ,</w:t>
-      </w:r>
-      <w:proofErr w:type="gramEnd"/>
-      <w:r>
-        <w:rPr>
-          <w:rFonts w:ascii="Consolas" w:hAnsi="Consolas"/>
-          <w:color w:val="000000"/>
-          <w:sz w:val="20"/>
-          <w:szCs w:val="20"/>
-        </w:rPr>
-        <w:t xml:space="preserve"> </w:t>
-      </w:r>
-      <w:proofErr w:type="gramStart"/>
+        <w:t>emp_name</w:t>
+      </w:r>
+      <w:r>
+        <w:rPr>
+          <w:rFonts w:ascii="Consolas" w:hAnsi="Consolas"/>
+          <w:color w:val="000000"/>
+          <w:sz w:val="20"/>
+          <w:szCs w:val="20"/>
+        </w:rPr>
+        <w:t xml:space="preserve"> , </w:t>
+      </w:r>
       <w:r>
         <w:rPr>
           <w:rFonts w:ascii="Consolas" w:hAnsi="Consolas"/>
@@ -1580,17 +1448,7 @@
           <w:sz w:val="20"/>
           <w:szCs w:val="20"/>
         </w:rPr>
-        <w:t>dept</w:t>
-      </w:r>
-      <w:proofErr w:type="gramEnd"/>
-      <w:r>
-        <w:rPr>
-          <w:rFonts w:ascii="Consolas" w:hAnsi="Consolas"/>
-          <w:color w:val="006464"/>
-          <w:sz w:val="20"/>
-          <w:szCs w:val="20"/>
-        </w:rPr>
-        <w:t>_name</w:t>
+        <w:t>dept_name</w:t>
       </w:r>
       <w:r>
         <w:rPr>
@@ -1785,7 +1643,6 @@
         </w:rPr>
         <w:t xml:space="preserve"> </w:t>
       </w:r>
-      <w:proofErr w:type="gramStart"/>
       <w:r>
         <w:rPr>
           <w:rFonts w:ascii="Consolas" w:hAnsi="Consolas"/>
@@ -1813,17 +1670,7 @@
           <w:sz w:val="20"/>
           <w:szCs w:val="20"/>
         </w:rPr>
-        <w:t>dept</w:t>
-      </w:r>
-      <w:proofErr w:type="gramEnd"/>
-      <w:r>
-        <w:rPr>
-          <w:rFonts w:ascii="Consolas" w:hAnsi="Consolas"/>
-          <w:color w:val="006464"/>
-          <w:sz w:val="20"/>
-          <w:szCs w:val="20"/>
-        </w:rPr>
-        <w:t>_id</w:t>
+        <w:t>dept_id</w:t>
       </w:r>
       <w:r>
         <w:rPr>
@@ -1834,7 +1681,6 @@
         </w:rPr>
         <w:t xml:space="preserve"> = </w:t>
       </w:r>
-      <w:proofErr w:type="gramStart"/>
       <w:r>
         <w:rPr>
           <w:rFonts w:ascii="Consolas" w:hAnsi="Consolas"/>
@@ -1862,17 +1708,7 @@
           <w:sz w:val="20"/>
           <w:szCs w:val="20"/>
         </w:rPr>
-        <w:t>dept</w:t>
-      </w:r>
-      <w:proofErr w:type="gramEnd"/>
-      <w:r>
-        <w:rPr>
-          <w:rFonts w:ascii="Consolas" w:hAnsi="Consolas"/>
-          <w:color w:val="006464"/>
-          <w:sz w:val="20"/>
-          <w:szCs w:val="20"/>
-        </w:rPr>
-        <w:t>_id</w:t>
+        <w:t>dept_id</w:t>
       </w:r>
       <w:r>
         <w:rPr>
@@ -2048,38 +1884,17 @@
           <w:sz w:val="20"/>
           <w:szCs w:val="20"/>
         </w:rPr>
-        <w:t>emp_</w:t>
-      </w:r>
-      <w:proofErr w:type="gramStart"/>
-      <w:r>
-        <w:rPr>
-          <w:rFonts w:ascii="Consolas" w:hAnsi="Consolas"/>
-          <w:color w:val="006464"/>
-          <w:sz w:val="20"/>
-          <w:szCs w:val="20"/>
-        </w:rPr>
-        <w:t>name</w:t>
-      </w:r>
-      <w:r>
-        <w:rPr>
-          <w:rFonts w:ascii="Consolas" w:hAnsi="Consolas"/>
-          <w:color w:val="000000"/>
-          <w:sz w:val="20"/>
-          <w:szCs w:val="20"/>
-        </w:rPr>
-        <w:t xml:space="preserve"> ,</w:t>
-      </w:r>
-      <w:proofErr w:type="gramEnd"/>
-      <w:r>
-        <w:rPr>
-          <w:rFonts w:ascii="Consolas" w:hAnsi="Consolas"/>
-          <w:color w:val="000000"/>
-          <w:sz w:val="20"/>
-          <w:szCs w:val="20"/>
-        </w:rPr>
-        <w:t xml:space="preserve"> </w:t>
-      </w:r>
-      <w:proofErr w:type="gramStart"/>
+        <w:t>emp_name</w:t>
+      </w:r>
+      <w:r>
+        <w:rPr>
+          <w:rFonts w:ascii="Consolas" w:hAnsi="Consolas"/>
+          <w:color w:val="000000"/>
+          <w:sz w:val="20"/>
+          <w:szCs w:val="20"/>
+        </w:rPr>
+        <w:t xml:space="preserve"> , </w:t>
+      </w:r>
       <w:r>
         <w:rPr>
           <w:rFonts w:ascii="Consolas" w:hAnsi="Consolas"/>
@@ -2107,17 +1922,7 @@
           <w:sz w:val="20"/>
           <w:szCs w:val="20"/>
         </w:rPr>
-        <w:t>dept</w:t>
-      </w:r>
-      <w:proofErr w:type="gramEnd"/>
-      <w:r>
-        <w:rPr>
-          <w:rFonts w:ascii="Consolas" w:hAnsi="Consolas"/>
-          <w:color w:val="006464"/>
-          <w:sz w:val="20"/>
-          <w:szCs w:val="20"/>
-        </w:rPr>
-        <w:t>_name</w:t>
+        <w:t>dept_name</w:t>
       </w:r>
       <w:r>
         <w:rPr>
@@ -2332,7 +2137,6 @@
         </w:rPr>
         <w:t xml:space="preserve"> </w:t>
       </w:r>
-      <w:proofErr w:type="gramStart"/>
       <w:r>
         <w:rPr>
           <w:rFonts w:ascii="Consolas" w:hAnsi="Consolas"/>
@@ -2360,17 +2164,7 @@
           <w:sz w:val="20"/>
           <w:szCs w:val="20"/>
         </w:rPr>
-        <w:t>dept</w:t>
-      </w:r>
-      <w:proofErr w:type="gramEnd"/>
-      <w:r>
-        <w:rPr>
-          <w:rFonts w:ascii="Consolas" w:hAnsi="Consolas"/>
-          <w:color w:val="006464"/>
-          <w:sz w:val="20"/>
-          <w:szCs w:val="20"/>
-        </w:rPr>
-        <w:t>_id</w:t>
+        <w:t>dept_id</w:t>
       </w:r>
       <w:r>
         <w:rPr>
@@ -2381,7 +2175,6 @@
         </w:rPr>
         <w:t xml:space="preserve"> = </w:t>
       </w:r>
-      <w:proofErr w:type="gramStart"/>
       <w:r>
         <w:rPr>
           <w:rFonts w:ascii="Consolas" w:hAnsi="Consolas"/>
@@ -2409,17 +2202,7 @@
           <w:sz w:val="20"/>
           <w:szCs w:val="20"/>
         </w:rPr>
-        <w:t>dept</w:t>
-      </w:r>
-      <w:proofErr w:type="gramEnd"/>
-      <w:r>
-        <w:rPr>
-          <w:rFonts w:ascii="Consolas" w:hAnsi="Consolas"/>
-          <w:color w:val="006464"/>
-          <w:sz w:val="20"/>
-          <w:szCs w:val="20"/>
-        </w:rPr>
-        <w:t>_id</w:t>
+        <w:t>dept_id</w:t>
       </w:r>
       <w:r>
         <w:rPr>
@@ -2524,13 +2307,8 @@
         <w:t>Subquery</w:t>
       </w:r>
       <w:r>
-        <w:t xml:space="preserve"> là một truy vấn nằm bên trong một truy vấn SQL khác. Nó có thể được sử dụng trong các mệnh đề SELECT, FROM, </w:t>
-      </w:r>
-      <w:proofErr w:type="gramStart"/>
-      <w:r>
-        <w:t>WHERE</w:t>
-      </w:r>
-      <w:proofErr w:type="gramEnd"/>
+        <w:t xml:space="preserve"> là một truy vấn nằm bên trong một truy vấn SQL khác. Nó có thể được sử dụng trong các mệnh đề SELECT, FROM, WHERE</w:t>
+      </w:r>
       <w:r>
         <w:t>, HAVING</w:t>
       </w:r>
@@ -2542,7 +2320,6 @@
       <w:r>
         <w:t xml:space="preserve">Subquery trong mệnh đề </w:t>
       </w:r>
-      <w:proofErr w:type="gramStart"/>
       <w:r>
         <w:rPr>
           <w:b/>
@@ -2550,7 +2327,6 @@
         </w:rPr>
         <w:t>WHERE</w:t>
       </w:r>
-      <w:proofErr w:type="gramEnd"/>
     </w:p>
     <w:p>
       <w:pPr>
@@ -2650,38 +2426,17 @@
           <w:sz w:val="20"/>
           <w:szCs w:val="20"/>
         </w:rPr>
-        <w:t>emp_</w:t>
-      </w:r>
-      <w:proofErr w:type="gramStart"/>
-      <w:r>
-        <w:rPr>
-          <w:rFonts w:ascii="Consolas" w:hAnsi="Consolas"/>
-          <w:color w:val="006464"/>
-          <w:sz w:val="20"/>
-          <w:szCs w:val="20"/>
-        </w:rPr>
-        <w:t>name</w:t>
-      </w:r>
-      <w:r>
-        <w:rPr>
-          <w:rFonts w:ascii="Consolas" w:hAnsi="Consolas"/>
-          <w:color w:val="000000"/>
-          <w:sz w:val="20"/>
-          <w:szCs w:val="20"/>
-        </w:rPr>
-        <w:t xml:space="preserve"> ,</w:t>
-      </w:r>
-      <w:proofErr w:type="gramEnd"/>
-      <w:r>
-        <w:rPr>
-          <w:rFonts w:ascii="Consolas" w:hAnsi="Consolas"/>
-          <w:color w:val="000000"/>
-          <w:sz w:val="20"/>
-          <w:szCs w:val="20"/>
-        </w:rPr>
-        <w:t xml:space="preserve"> </w:t>
-      </w:r>
-      <w:proofErr w:type="gramStart"/>
+        <w:t>emp_name</w:t>
+      </w:r>
+      <w:r>
+        <w:rPr>
+          <w:rFonts w:ascii="Consolas" w:hAnsi="Consolas"/>
+          <w:color w:val="000000"/>
+          <w:sz w:val="20"/>
+          <w:szCs w:val="20"/>
+        </w:rPr>
+        <w:t xml:space="preserve"> , </w:t>
+      </w:r>
       <w:r>
         <w:rPr>
           <w:rFonts w:ascii="Consolas" w:hAnsi="Consolas"/>
@@ -2711,7 +2466,6 @@
         </w:rPr>
         <w:t>salary</w:t>
       </w:r>
-      <w:proofErr w:type="gramEnd"/>
       <w:r>
         <w:rPr>
           <w:rFonts w:ascii="Consolas" w:hAnsi="Consolas"/>
@@ -2827,7 +2581,6 @@
         </w:rPr>
         <w:t xml:space="preserve"> </w:t>
       </w:r>
-      <w:proofErr w:type="gramStart"/>
       <w:r>
         <w:rPr>
           <w:rFonts w:ascii="Consolas" w:hAnsi="Consolas"/>
@@ -2857,7 +2610,6 @@
         </w:rPr>
         <w:t>salary</w:t>
       </w:r>
-      <w:proofErr w:type="gramEnd"/>
       <w:r>
         <w:rPr>
           <w:rFonts w:ascii="Consolas" w:hAnsi="Consolas"/>
@@ -2910,7 +2662,6 @@
         </w:rPr>
         <w:t xml:space="preserve"> </w:t>
       </w:r>
-      <w:proofErr w:type="gramStart"/>
       <w:r>
         <w:rPr>
           <w:rFonts w:ascii="Consolas" w:hAnsi="Consolas"/>
@@ -2931,7 +2682,6 @@
         </w:rPr>
         <w:t>(</w:t>
       </w:r>
-      <w:proofErr w:type="gramEnd"/>
       <w:r>
         <w:rPr>
           <w:rFonts w:ascii="Consolas" w:hAnsi="Consolas"/>
@@ -2941,19 +2691,7 @@
           <w:sz w:val="20"/>
           <w:szCs w:val="20"/>
         </w:rPr>
-        <w:t>e</w:t>
-      </w:r>
-      <w:proofErr w:type="gramStart"/>
-      <w:r>
-        <w:rPr>
-          <w:rFonts w:ascii="Consolas" w:hAnsi="Consolas"/>
-          <w:i/>
-          <w:iCs/>
-          <w:color w:val="8E00C6"/>
-          <w:sz w:val="20"/>
-          <w:szCs w:val="20"/>
-        </w:rPr>
-        <w:t>2</w:t>
+        <w:t>e2</w:t>
       </w:r>
       <w:r>
         <w:rPr>
@@ -2973,7 +2711,6 @@
         </w:rPr>
         <w:t>salary</w:t>
       </w:r>
-      <w:proofErr w:type="gramEnd"/>
       <w:r>
         <w:rPr>
           <w:rFonts w:ascii="Consolas" w:hAnsi="Consolas"/>
@@ -3152,7 +2889,6 @@
         </w:rPr>
         <w:t xml:space="preserve"> </w:t>
       </w:r>
-      <w:proofErr w:type="gramStart"/>
       <w:r>
         <w:rPr>
           <w:rFonts w:ascii="Consolas" w:hAnsi="Consolas"/>
@@ -3180,17 +2916,7 @@
           <w:sz w:val="20"/>
           <w:szCs w:val="20"/>
         </w:rPr>
-        <w:t>dept</w:t>
-      </w:r>
-      <w:proofErr w:type="gramEnd"/>
-      <w:r>
-        <w:rPr>
-          <w:rFonts w:ascii="Consolas" w:hAnsi="Consolas"/>
-          <w:color w:val="006464"/>
-          <w:sz w:val="20"/>
-          <w:szCs w:val="20"/>
-        </w:rPr>
-        <w:t>_name</w:t>
+        <w:t>dept_name</w:t>
       </w:r>
       <w:r>
         <w:rPr>
@@ -3201,7 +2927,6 @@
         </w:rPr>
         <w:t xml:space="preserve">, </w:t>
       </w:r>
-      <w:proofErr w:type="gramStart"/>
       <w:r>
         <w:rPr>
           <w:rFonts w:ascii="Consolas" w:hAnsi="Consolas"/>
@@ -3233,7 +2958,6 @@
         </w:rPr>
         <w:t>salary</w:t>
       </w:r>
-      <w:proofErr w:type="gramEnd"/>
       <w:r>
         <w:rPr>
           <w:rFonts w:ascii="Consolas" w:hAnsi="Consolas"/>
@@ -3413,7 +3137,6 @@
         </w:rPr>
         <w:t xml:space="preserve"> </w:t>
       </w:r>
-      <w:proofErr w:type="gramStart"/>
       <w:r>
         <w:rPr>
           <w:rFonts w:ascii="Consolas" w:hAnsi="Consolas"/>
@@ -3441,27 +3164,7 @@
           <w:sz w:val="20"/>
           <w:szCs w:val="20"/>
         </w:rPr>
-        <w:t>dept</w:t>
-      </w:r>
-      <w:proofErr w:type="gramEnd"/>
-      <w:r>
-        <w:rPr>
-          <w:rFonts w:ascii="Consolas" w:hAnsi="Consolas"/>
-          <w:color w:val="006464"/>
-          <w:sz w:val="20"/>
-          <w:szCs w:val="20"/>
-        </w:rPr>
-        <w:t>_</w:t>
-      </w:r>
-      <w:proofErr w:type="gramStart"/>
-      <w:r>
-        <w:rPr>
-          <w:rFonts w:ascii="Consolas" w:hAnsi="Consolas"/>
-          <w:color w:val="006464"/>
-          <w:sz w:val="20"/>
-          <w:szCs w:val="20"/>
-        </w:rPr>
-        <w:t>id</w:t>
+        <w:t>dept_id</w:t>
       </w:r>
       <w:r>
         <w:rPr>
@@ -3521,7 +3224,6 @@
         </w:rPr>
         <w:t>salary</w:t>
       </w:r>
-      <w:proofErr w:type="gramEnd"/>
       <w:r>
         <w:rPr>
           <w:rFonts w:ascii="Consolas" w:hAnsi="Consolas"/>
@@ -3706,7 +3408,6 @@
         </w:rPr>
         <w:t xml:space="preserve"> </w:t>
       </w:r>
-      <w:proofErr w:type="gramStart"/>
       <w:r>
         <w:rPr>
           <w:rFonts w:ascii="Consolas" w:hAnsi="Consolas"/>
@@ -3734,17 +3435,7 @@
           <w:sz w:val="20"/>
           <w:szCs w:val="20"/>
         </w:rPr>
-        <w:t>dept</w:t>
-      </w:r>
-      <w:proofErr w:type="gramEnd"/>
-      <w:r>
-        <w:rPr>
-          <w:rFonts w:ascii="Consolas" w:hAnsi="Consolas"/>
-          <w:color w:val="006464"/>
-          <w:sz w:val="20"/>
-          <w:szCs w:val="20"/>
-        </w:rPr>
-        <w:t>_id</w:t>
+        <w:t>dept_id</w:t>
       </w:r>
       <w:r>
         <w:rPr>
@@ -3823,7 +3514,6 @@
         </w:rPr>
         <w:t xml:space="preserve"> </w:t>
       </w:r>
-      <w:proofErr w:type="gramStart"/>
       <w:r>
         <w:rPr>
           <w:rFonts w:ascii="Consolas" w:hAnsi="Consolas"/>
@@ -3851,17 +3541,7 @@
           <w:sz w:val="20"/>
           <w:szCs w:val="20"/>
         </w:rPr>
-        <w:t>dept</w:t>
-      </w:r>
-      <w:proofErr w:type="gramEnd"/>
-      <w:r>
-        <w:rPr>
-          <w:rFonts w:ascii="Consolas" w:hAnsi="Consolas"/>
-          <w:color w:val="006464"/>
-          <w:sz w:val="20"/>
-          <w:szCs w:val="20"/>
-        </w:rPr>
-        <w:t>_id</w:t>
+        <w:t>dept_id</w:t>
       </w:r>
       <w:r>
         <w:rPr>
@@ -3872,7 +3552,6 @@
         </w:rPr>
         <w:t xml:space="preserve"> = </w:t>
       </w:r>
-      <w:proofErr w:type="gramStart"/>
       <w:r>
         <w:rPr>
           <w:rFonts w:ascii="Consolas" w:hAnsi="Consolas"/>
@@ -3900,17 +3579,7 @@
           <w:sz w:val="20"/>
           <w:szCs w:val="20"/>
         </w:rPr>
-        <w:t>dept</w:t>
-      </w:r>
-      <w:proofErr w:type="gramEnd"/>
-      <w:r>
-        <w:rPr>
-          <w:rFonts w:ascii="Consolas" w:hAnsi="Consolas"/>
-          <w:color w:val="006464"/>
-          <w:sz w:val="20"/>
-          <w:szCs w:val="20"/>
-        </w:rPr>
-        <w:t>_id</w:t>
+        <w:t>dept_id</w:t>
       </w:r>
       <w:r>
         <w:rPr>
@@ -4043,36 +3712,16 @@
           <w:sz w:val="20"/>
           <w:szCs w:val="20"/>
         </w:rPr>
-        <w:t>emp_</w:t>
-      </w:r>
-      <w:proofErr w:type="gramStart"/>
-      <w:r>
-        <w:rPr>
-          <w:rFonts w:ascii="Consolas" w:hAnsi="Consolas"/>
-          <w:color w:val="006464"/>
-          <w:sz w:val="20"/>
-          <w:szCs w:val="20"/>
-        </w:rPr>
-        <w:t>name</w:t>
-      </w:r>
-      <w:r>
-        <w:rPr>
-          <w:rFonts w:ascii="Consolas" w:hAnsi="Consolas"/>
-          <w:color w:val="000000"/>
-          <w:sz w:val="20"/>
-          <w:szCs w:val="20"/>
-        </w:rPr>
-        <w:t xml:space="preserve"> ,</w:t>
-      </w:r>
-      <w:proofErr w:type="gramEnd"/>
-      <w:r>
-        <w:rPr>
-          <w:rFonts w:ascii="Consolas" w:hAnsi="Consolas"/>
-          <w:color w:val="000000"/>
-          <w:sz w:val="20"/>
-          <w:szCs w:val="20"/>
-        </w:rPr>
-        <w:t xml:space="preserve"> </w:t>
+        <w:t>emp_name</w:t>
+      </w:r>
+      <w:r>
+        <w:rPr>
+          <w:rFonts w:ascii="Consolas" w:hAnsi="Consolas"/>
+          <w:color w:val="000000"/>
+          <w:sz w:val="20"/>
+          <w:szCs w:val="20"/>
+        </w:rPr>
+        <w:t xml:space="preserve"> , </w:t>
       </w:r>
       <w:r>
         <w:rPr>
@@ -4103,40 +3752,17 @@
           <w:sz w:val="20"/>
           <w:szCs w:val="20"/>
         </w:rPr>
-        <w:t>max_</w:t>
-      </w:r>
-      <w:proofErr w:type="gramStart"/>
-      <w:r>
-        <w:rPr>
-          <w:rFonts w:ascii="Consolas" w:hAnsi="Consolas"/>
-          <w:i/>
-          <w:iCs/>
-          <w:color w:val="006464"/>
-          <w:sz w:val="20"/>
-          <w:szCs w:val="20"/>
-        </w:rPr>
-        <w:t>salary</w:t>
-      </w:r>
-      <w:r>
-        <w:rPr>
-          <w:rFonts w:ascii="Consolas" w:hAnsi="Consolas"/>
-          <w:color w:val="000000"/>
-          <w:sz w:val="20"/>
-          <w:szCs w:val="20"/>
-        </w:rPr>
-        <w:t xml:space="preserve"> ,</w:t>
-      </w:r>
-      <w:proofErr w:type="gramEnd"/>
-      <w:r>
-        <w:rPr>
-          <w:rFonts w:ascii="Consolas" w:hAnsi="Consolas"/>
-          <w:color w:val="000000"/>
-          <w:sz w:val="20"/>
-          <w:szCs w:val="20"/>
-        </w:rPr>
-        <w:t xml:space="preserve"> </w:t>
-      </w:r>
-      <w:proofErr w:type="gramStart"/>
+        <w:t>max_salary</w:t>
+      </w:r>
+      <w:r>
+        <w:rPr>
+          <w:rFonts w:ascii="Consolas" w:hAnsi="Consolas"/>
+          <w:color w:val="000000"/>
+          <w:sz w:val="20"/>
+          <w:szCs w:val="20"/>
+        </w:rPr>
+        <w:t xml:space="preserve"> , </w:t>
+      </w:r>
       <w:r>
         <w:rPr>
           <w:rFonts w:ascii="Consolas" w:hAnsi="Consolas"/>
@@ -4164,17 +3790,7 @@
           <w:sz w:val="20"/>
           <w:szCs w:val="20"/>
         </w:rPr>
-        <w:t>dept</w:t>
-      </w:r>
-      <w:proofErr w:type="gramEnd"/>
-      <w:r>
-        <w:rPr>
-          <w:rFonts w:ascii="Consolas" w:hAnsi="Consolas"/>
-          <w:color w:val="006464"/>
-          <w:sz w:val="20"/>
-          <w:szCs w:val="20"/>
-        </w:rPr>
-        <w:t>_name</w:t>
+        <w:t>dept_name</w:t>
       </w:r>
       <w:r>
         <w:rPr>
@@ -4262,7 +3878,6 @@
         </w:rPr>
         <w:t xml:space="preserve"> </w:t>
       </w:r>
-      <w:proofErr w:type="gramStart"/>
       <w:r>
         <w:rPr>
           <w:rFonts w:ascii="Consolas" w:hAnsi="Consolas"/>
@@ -4290,48 +3905,17 @@
           <w:sz w:val="20"/>
           <w:szCs w:val="20"/>
         </w:rPr>
-        <w:t>dept</w:t>
-      </w:r>
-      <w:proofErr w:type="gramEnd"/>
-      <w:r>
-        <w:rPr>
-          <w:rFonts w:ascii="Consolas" w:hAnsi="Consolas"/>
-          <w:color w:val="006464"/>
-          <w:sz w:val="20"/>
-          <w:szCs w:val="20"/>
-        </w:rPr>
-        <w:t>_</w:t>
-      </w:r>
-      <w:proofErr w:type="gramStart"/>
-      <w:r>
-        <w:rPr>
-          <w:rFonts w:ascii="Consolas" w:hAnsi="Consolas"/>
-          <w:color w:val="006464"/>
-          <w:sz w:val="20"/>
-          <w:szCs w:val="20"/>
-        </w:rPr>
-        <w:t>id</w:t>
-      </w:r>
-      <w:r>
-        <w:rPr>
-          <w:rFonts w:ascii="Consolas" w:hAnsi="Consolas"/>
-          <w:color w:val="000000"/>
-          <w:sz w:val="20"/>
-          <w:szCs w:val="20"/>
-        </w:rPr>
-        <w:t xml:space="preserve"> ,</w:t>
-      </w:r>
-      <w:proofErr w:type="gramEnd"/>
-      <w:r>
-        <w:rPr>
-          <w:rFonts w:ascii="Consolas" w:hAnsi="Consolas"/>
-          <w:color w:val="000000"/>
-          <w:sz w:val="20"/>
-          <w:szCs w:val="20"/>
-        </w:rPr>
-        <w:t xml:space="preserve"> </w:t>
-      </w:r>
-      <w:proofErr w:type="gramStart"/>
+        <w:t>dept_id</w:t>
+      </w:r>
+      <w:r>
+        <w:rPr>
+          <w:rFonts w:ascii="Consolas" w:hAnsi="Consolas"/>
+          <w:color w:val="000000"/>
+          <w:sz w:val="20"/>
+          <w:szCs w:val="20"/>
+        </w:rPr>
+        <w:t xml:space="preserve"> , </w:t>
+      </w:r>
       <w:r>
         <w:rPr>
           <w:rFonts w:ascii="Consolas" w:hAnsi="Consolas"/>
@@ -4381,7 +3965,6 @@
         </w:rPr>
         <w:t>salary</w:t>
       </w:r>
-      <w:proofErr w:type="gramEnd"/>
       <w:r>
         <w:rPr>
           <w:rFonts w:ascii="Consolas" w:hAnsi="Consolas"/>
@@ -4566,7 +4149,6 @@
         </w:rPr>
         <w:t xml:space="preserve"> </w:t>
       </w:r>
-      <w:proofErr w:type="gramStart"/>
       <w:r>
         <w:rPr>
           <w:rFonts w:ascii="Consolas" w:hAnsi="Consolas"/>
@@ -4594,17 +4176,7 @@
           <w:sz w:val="20"/>
           <w:szCs w:val="20"/>
         </w:rPr>
-        <w:t>dept</w:t>
-      </w:r>
-      <w:proofErr w:type="gramEnd"/>
-      <w:r>
-        <w:rPr>
-          <w:rFonts w:ascii="Consolas" w:hAnsi="Consolas"/>
-          <w:color w:val="006464"/>
-          <w:sz w:val="20"/>
-          <w:szCs w:val="20"/>
-        </w:rPr>
-        <w:t>_id</w:t>
+        <w:t>dept_id</w:t>
       </w:r>
       <w:r>
         <w:rPr>
@@ -4770,19 +4342,7 @@
           <w:sz w:val="20"/>
           <w:szCs w:val="20"/>
         </w:rPr>
-        <w:t>e</w:t>
-      </w:r>
-      <w:proofErr w:type="gramStart"/>
-      <w:r>
-        <w:rPr>
-          <w:rFonts w:ascii="Consolas" w:hAnsi="Consolas"/>
-          <w:i/>
-          <w:iCs/>
-          <w:color w:val="8E00C6"/>
-          <w:sz w:val="20"/>
-          <w:szCs w:val="20"/>
-        </w:rPr>
-        <w:t>2</w:t>
+        <w:t>e2</w:t>
       </w:r>
       <w:r>
         <w:rPr>
@@ -4802,7 +4362,6 @@
         </w:rPr>
         <w:t>salary</w:t>
       </w:r>
-      <w:proofErr w:type="gramEnd"/>
       <w:r>
         <w:rPr>
           <w:rFonts w:ascii="Consolas" w:hAnsi="Consolas"/>
@@ -4924,7 +4483,6 @@
         </w:rPr>
         <w:t xml:space="preserve"> </w:t>
       </w:r>
-      <w:proofErr w:type="gramStart"/>
       <w:r>
         <w:rPr>
           <w:rFonts w:ascii="Consolas" w:hAnsi="Consolas"/>
@@ -4956,7 +4514,6 @@
         </w:rPr>
         <w:t>on</w:t>
       </w:r>
-      <w:proofErr w:type="gramEnd"/>
       <w:r>
         <w:rPr>
           <w:rFonts w:ascii="Consolas" w:hAnsi="Consolas"/>
@@ -4966,7 +4523,6 @@
         </w:rPr>
         <w:t xml:space="preserve"> </w:t>
       </w:r>
-      <w:proofErr w:type="gramStart"/>
       <w:r>
         <w:rPr>
           <w:rFonts w:ascii="Consolas" w:hAnsi="Consolas"/>
@@ -4994,17 +4550,7 @@
           <w:sz w:val="20"/>
           <w:szCs w:val="20"/>
         </w:rPr>
-        <w:t>dept</w:t>
-      </w:r>
-      <w:proofErr w:type="gramEnd"/>
-      <w:r>
-        <w:rPr>
-          <w:rFonts w:ascii="Consolas" w:hAnsi="Consolas"/>
-          <w:color w:val="006464"/>
-          <w:sz w:val="20"/>
-          <w:szCs w:val="20"/>
-        </w:rPr>
-        <w:t>_id</w:t>
+        <w:t>dept_id</w:t>
       </w:r>
       <w:r>
         <w:rPr>
@@ -5015,7 +4561,6 @@
         </w:rPr>
         <w:t xml:space="preserve"> = </w:t>
       </w:r>
-      <w:proofErr w:type="gramStart"/>
       <w:r>
         <w:rPr>
           <w:rFonts w:ascii="Consolas" w:hAnsi="Consolas"/>
@@ -5043,17 +4588,7 @@
           <w:sz w:val="20"/>
           <w:szCs w:val="20"/>
         </w:rPr>
-        <w:t>dept</w:t>
-      </w:r>
-      <w:proofErr w:type="gramEnd"/>
-      <w:r>
-        <w:rPr>
-          <w:rFonts w:ascii="Consolas" w:hAnsi="Consolas"/>
-          <w:color w:val="006464"/>
-          <w:sz w:val="20"/>
-          <w:szCs w:val="20"/>
-        </w:rPr>
-        <w:t>_id</w:t>
+        <w:t>dept_id</w:t>
       </w:r>
       <w:r>
         <w:rPr>
@@ -5223,7 +4758,6 @@
         </w:rPr>
         <w:t xml:space="preserve"> </w:t>
       </w:r>
-      <w:proofErr w:type="gramStart"/>
       <w:r>
         <w:rPr>
           <w:rFonts w:ascii="Consolas" w:hAnsi="Consolas"/>
@@ -5251,17 +4785,7 @@
           <w:sz w:val="20"/>
           <w:szCs w:val="20"/>
         </w:rPr>
-        <w:t>dept</w:t>
-      </w:r>
-      <w:proofErr w:type="gramEnd"/>
-      <w:r>
-        <w:rPr>
-          <w:rFonts w:ascii="Consolas" w:hAnsi="Consolas"/>
-          <w:color w:val="006464"/>
-          <w:sz w:val="20"/>
-          <w:szCs w:val="20"/>
-        </w:rPr>
-        <w:t>_name</w:t>
+        <w:t>dept_name</w:t>
       </w:r>
       <w:r>
         <w:rPr>
@@ -5583,7 +5107,6 @@
         </w:rPr>
         <w:t xml:space="preserve"> </w:t>
       </w:r>
-      <w:proofErr w:type="gramStart"/>
       <w:r>
         <w:rPr>
           <w:rFonts w:ascii="Consolas" w:hAnsi="Consolas"/>
@@ -5611,17 +5134,7 @@
           <w:sz w:val="20"/>
           <w:szCs w:val="20"/>
         </w:rPr>
-        <w:t>dept</w:t>
-      </w:r>
-      <w:proofErr w:type="gramEnd"/>
-      <w:r>
-        <w:rPr>
-          <w:rFonts w:ascii="Consolas" w:hAnsi="Consolas"/>
-          <w:color w:val="006464"/>
-          <w:sz w:val="20"/>
-          <w:szCs w:val="20"/>
-        </w:rPr>
-        <w:t>_id</w:t>
+        <w:t>dept_id</w:t>
       </w:r>
       <w:r>
         <w:rPr>
@@ -5632,7 +5145,6 @@
         </w:rPr>
         <w:t xml:space="preserve"> = </w:t>
       </w:r>
-      <w:proofErr w:type="gramStart"/>
       <w:r>
         <w:rPr>
           <w:rFonts w:ascii="Consolas" w:hAnsi="Consolas"/>
@@ -5660,17 +5172,7 @@
           <w:sz w:val="20"/>
           <w:szCs w:val="20"/>
         </w:rPr>
-        <w:t>dept</w:t>
-      </w:r>
-      <w:proofErr w:type="gramEnd"/>
-      <w:r>
-        <w:rPr>
-          <w:rFonts w:ascii="Consolas" w:hAnsi="Consolas"/>
-          <w:color w:val="006464"/>
-          <w:sz w:val="20"/>
-          <w:szCs w:val="20"/>
-        </w:rPr>
-        <w:t>_id</w:t>
+        <w:t>dept_id</w:t>
       </w:r>
       <w:r>
         <w:rPr>
@@ -5753,7 +5255,6 @@
         </w:rPr>
         <w:t xml:space="preserve"> </w:t>
       </w:r>
-      <w:proofErr w:type="gramStart"/>
       <w:r>
         <w:rPr>
           <w:rFonts w:ascii="Consolas" w:hAnsi="Consolas"/>
@@ -5781,17 +5282,7 @@
           <w:sz w:val="20"/>
           <w:szCs w:val="20"/>
         </w:rPr>
-        <w:t>dept</w:t>
-      </w:r>
-      <w:proofErr w:type="gramEnd"/>
-      <w:r>
-        <w:rPr>
-          <w:rFonts w:ascii="Consolas" w:hAnsi="Consolas"/>
-          <w:color w:val="006464"/>
-          <w:sz w:val="20"/>
-          <w:szCs w:val="20"/>
-        </w:rPr>
-        <w:t>_name</w:t>
+        <w:t>dept_name</w:t>
       </w:r>
       <w:r>
         <w:rPr>
@@ -5908,7 +5399,6 @@
         </w:rPr>
         <w:t xml:space="preserve"> </w:t>
       </w:r>
-      <w:proofErr w:type="gramStart"/>
       <w:r>
         <w:rPr>
           <w:rFonts w:ascii="Consolas" w:hAnsi="Consolas"/>
@@ -5936,17 +5426,7 @@
           <w:sz w:val="20"/>
           <w:szCs w:val="20"/>
         </w:rPr>
-        <w:t>dept</w:t>
-      </w:r>
-      <w:proofErr w:type="gramEnd"/>
-      <w:r>
-        <w:rPr>
-          <w:rFonts w:ascii="Consolas" w:hAnsi="Consolas"/>
-          <w:color w:val="006464"/>
-          <w:sz w:val="20"/>
-          <w:szCs w:val="20"/>
-        </w:rPr>
-        <w:t>_id</w:t>
+        <w:t>dept_id</w:t>
       </w:r>
       <w:r>
         <w:rPr>
@@ -6040,7 +5520,6 @@
         </w:rPr>
         <w:t xml:space="preserve"> </w:t>
       </w:r>
-      <w:proofErr w:type="gramStart"/>
       <w:r>
         <w:rPr>
           <w:rFonts w:ascii="Consolas" w:hAnsi="Consolas"/>
@@ -6068,17 +5547,7 @@
           <w:sz w:val="20"/>
           <w:szCs w:val="20"/>
         </w:rPr>
-        <w:t>dept</w:t>
-      </w:r>
-      <w:proofErr w:type="gramEnd"/>
-      <w:r>
-        <w:rPr>
-          <w:rFonts w:ascii="Consolas" w:hAnsi="Consolas"/>
-          <w:color w:val="006464"/>
-          <w:sz w:val="20"/>
-          <w:szCs w:val="20"/>
-        </w:rPr>
-        <w:t>_id</w:t>
+        <w:t>dept_id</w:t>
       </w:r>
       <w:r>
         <w:rPr>
@@ -6332,7 +5801,6 @@
         </w:rPr>
         <w:t xml:space="preserve">) </w:t>
       </w:r>
-      <w:proofErr w:type="gramStart"/>
       <w:r>
         <w:rPr>
           <w:rFonts w:ascii="Consolas" w:hAnsi="Consolas"/>
@@ -6353,7 +5821,6 @@
         </w:rPr>
         <w:t>(</w:t>
       </w:r>
-      <w:proofErr w:type="gramEnd"/>
     </w:p>
     <w:p>
       <w:pPr>
@@ -6424,17 +5891,7 @@
           <w:sz w:val="20"/>
           <w:szCs w:val="20"/>
         </w:rPr>
-        <w:t>emp_</w:t>
-      </w:r>
-      <w:proofErr w:type="gramStart"/>
-      <w:r>
-        <w:rPr>
-          <w:rFonts w:ascii="Consolas" w:hAnsi="Consolas"/>
-          <w:color w:val="006464"/>
-          <w:sz w:val="20"/>
-          <w:szCs w:val="20"/>
-        </w:rPr>
-        <w:t>id</w:t>
+        <w:t>emp_id</w:t>
       </w:r>
       <w:r>
         <w:rPr>
@@ -6456,7 +5913,6 @@
         </w:rPr>
         <w:t>from</w:t>
       </w:r>
-      <w:proofErr w:type="gramEnd"/>
       <w:r>
         <w:rPr>
           <w:rFonts w:ascii="Consolas" w:hAnsi="Consolas"/>
@@ -6524,7 +5980,6 @@
         </w:rPr>
         <w:t xml:space="preserve"> </w:t>
       </w:r>
-      <w:proofErr w:type="gramStart"/>
       <w:r>
         <w:rPr>
           <w:rFonts w:ascii="Consolas" w:hAnsi="Consolas"/>
@@ -6554,7 +6009,6 @@
         </w:rPr>
         <w:t>salary</w:t>
       </w:r>
-      <w:proofErr w:type="gramEnd"/>
       <w:r>
         <w:rPr>
           <w:rFonts w:ascii="Consolas" w:hAnsi="Consolas"/>
@@ -6749,17 +6203,7 @@
           <w:sz w:val="20"/>
           <w:szCs w:val="20"/>
         </w:rPr>
-        <w:t>emp_</w:t>
-      </w:r>
-      <w:proofErr w:type="gramStart"/>
-      <w:r>
-        <w:rPr>
-          <w:rFonts w:ascii="Consolas" w:hAnsi="Consolas"/>
-          <w:color w:val="006464"/>
-          <w:sz w:val="20"/>
-          <w:szCs w:val="20"/>
-        </w:rPr>
-        <w:t>id</w:t>
+        <w:t>emp_id</w:t>
       </w:r>
       <w:r>
         <w:rPr>
@@ -6781,7 +6225,6 @@
         </w:rPr>
         <w:t>in</w:t>
       </w:r>
-      <w:proofErr w:type="gramEnd"/>
       <w:r>
         <w:rPr>
           <w:rFonts w:ascii="Consolas" w:hAnsi="Consolas"/>
@@ -6811,7 +6254,6 @@
         </w:rPr>
         <w:t xml:space="preserve"> </w:t>
       </w:r>
-      <w:proofErr w:type="gramStart"/>
       <w:r>
         <w:rPr>
           <w:rFonts w:ascii="Consolas" w:hAnsi="Consolas"/>
@@ -6843,7 +6285,6 @@
         </w:rPr>
         <w:t>from</w:t>
       </w:r>
-      <w:proofErr w:type="gramEnd"/>
       <w:r>
         <w:rPr>
           <w:rFonts w:ascii="Consolas" w:hAnsi="Consolas"/>
@@ -6853,7 +6294,6 @@
         </w:rPr>
         <w:t xml:space="preserve"> </w:t>
       </w:r>
-      <w:proofErr w:type="gramStart"/>
       <w:r>
         <w:rPr>
           <w:rFonts w:ascii="Consolas" w:hAnsi="Consolas"/>
@@ -6874,7 +6314,6 @@
         </w:rPr>
         <w:t xml:space="preserve"> )</w:t>
       </w:r>
-      <w:proofErr w:type="gramEnd"/>
     </w:p>
     <w:p>
       <w:pPr>
@@ -7471,15 +6910,7 @@
         </w:rPr>
       </w:pPr>
       <w:r>
-        <w:t xml:space="preserve">+ </w:t>
-      </w:r>
-      <w:proofErr w:type="gramStart"/>
-      <w:r>
-        <w:t>Ranking :</w:t>
-      </w:r>
-      <w:proofErr w:type="gramEnd"/>
-      <w:r>
-        <w:t xml:space="preserve"> ROW_NUMBER, RANK, DENSE_RANK</w:t>
+        <w:t>+ Ranking : ROW_NUMBER, RANK, DENSE_RANK</w:t>
       </w:r>
     </w:p>
     <w:p>
@@ -7883,7 +7314,6 @@
         </w:rPr>
         <w:t xml:space="preserve"> deptno, </w:t>
       </w:r>
-      <w:proofErr w:type="gramStart"/>
       <w:r>
         <w:rPr>
           <w:rFonts w:ascii="Consolas" w:hAnsi="Consolas"/>
@@ -7904,7 +7334,6 @@
         </w:rPr>
         <w:t>;</w:t>
       </w:r>
-      <w:proofErr w:type="gramEnd"/>
     </w:p>
     <w:p>
       <w:pPr>
@@ -11252,15 +10681,7 @@
         <w:t xml:space="preserve"> </w:t>
       </w:r>
       <w:r>
-        <w:t xml:space="preserve">Tương tự như </w:t>
-      </w:r>
-      <w:proofErr w:type="gramStart"/>
-      <w:r>
-        <w:t>RANK(</w:t>
-      </w:r>
-      <w:proofErr w:type="gramEnd"/>
-      <w:r>
-        <w:t xml:space="preserve">), nhưng không bỏ qua thứ hạng tiếp theo khi có các giá trị trùng lặp. </w:t>
+        <w:t xml:space="preserve">Tương tự như RANK(), nhưng không bỏ qua thứ hạng tiếp theo khi có các giá trị trùng lặp. </w:t>
       </w:r>
     </w:p>
     <w:p>
@@ -11811,17 +11232,7 @@
           <w:sz w:val="20"/>
           <w:szCs w:val="20"/>
         </w:rPr>
-        <w:t xml:space="preserve"> </w:t>
-      </w:r>
-      <w:proofErr w:type="gramStart"/>
-      <w:r>
-        <w:rPr>
-          <w:rFonts w:ascii="Consolas" w:hAnsi="Consolas"/>
-          <w:color w:val="000000"/>
-          <w:sz w:val="20"/>
-          <w:szCs w:val="20"/>
-        </w:rPr>
-        <w:t>deptno</w:t>
+        <w:t xml:space="preserve"> deptno</w:t>
       </w:r>
       <w:r>
         <w:rPr>
@@ -11832,7 +11243,6 @@
         </w:rPr>
         <w:t>;</w:t>
       </w:r>
-      <w:proofErr w:type="gramEnd"/>
     </w:p>
     <w:p/>
     <w:tbl>
@@ -14523,21 +13933,8 @@
     <w:p>
       <w:r>
         <w:br/>
-        <w:t xml:space="preserve">+ </w:t>
-      </w:r>
-      <w:proofErr w:type="gramStart"/>
-      <w:r>
-        <w:t>VIEW :</w:t>
-      </w:r>
-      <w:proofErr w:type="gramEnd"/>
-      <w:r>
-        <w:t xml:space="preserve"> Có thể CRUD trên VIEW được </w:t>
-      </w:r>
-      <w:proofErr w:type="gramStart"/>
-      <w:r>
-        <w:t>không ?</w:t>
-      </w:r>
-      <w:proofErr w:type="gramEnd"/>
+        <w:t>+ VIEW : Có thể CRUD trên VIEW được không ?</w:t>
+      </w:r>
     </w:p>
     <w:p>
       <w:r>
@@ -14613,31 +14010,7 @@
         </w:numPr>
       </w:pPr>
       <w:r>
-        <w:t xml:space="preserve">View không chứa các hàm tổng hợp như </w:t>
-      </w:r>
-      <w:proofErr w:type="gramStart"/>
-      <w:r>
-        <w:t>SUM(</w:t>
-      </w:r>
-      <w:proofErr w:type="gramEnd"/>
-      <w:r>
-        <w:t xml:space="preserve">), </w:t>
-      </w:r>
-      <w:proofErr w:type="gramStart"/>
-      <w:r>
-        <w:t>AVG(</w:t>
-      </w:r>
-      <w:proofErr w:type="gramEnd"/>
-      <w:r>
-        <w:t xml:space="preserve">), </w:t>
-      </w:r>
-      <w:proofErr w:type="gramStart"/>
-      <w:r>
-        <w:t>COUNT(</w:t>
-      </w:r>
-      <w:proofErr w:type="gramEnd"/>
-      <w:r>
-        <w:t>).</w:t>
+        <w:t>View không chứa các hàm tổng hợp như SUM(), AVG(), COUNT().</w:t>
       </w:r>
     </w:p>
     <w:p>
@@ -14787,7 +14160,6 @@
         </w:rPr>
         <w:t xml:space="preserve"> </w:t>
       </w:r>
-      <w:proofErr w:type="gramStart"/>
       <w:r>
         <w:rPr>
           <w:rFonts w:ascii="Consolas" w:hAnsi="Consolas"/>
@@ -14815,46 +14187,16 @@
           <w:sz w:val="20"/>
           <w:szCs w:val="20"/>
         </w:rPr>
-        <w:t>dept</w:t>
-      </w:r>
-      <w:proofErr w:type="gramEnd"/>
-      <w:r>
-        <w:rPr>
-          <w:rFonts w:ascii="Consolas" w:hAnsi="Consolas"/>
-          <w:color w:val="006464"/>
-          <w:sz w:val="20"/>
-          <w:szCs w:val="20"/>
-        </w:rPr>
-        <w:t>_</w:t>
-      </w:r>
-      <w:proofErr w:type="gramStart"/>
-      <w:r>
-        <w:rPr>
-          <w:rFonts w:ascii="Consolas" w:hAnsi="Consolas"/>
-          <w:color w:val="006464"/>
-          <w:sz w:val="20"/>
-          <w:szCs w:val="20"/>
-        </w:rPr>
-        <w:t>name</w:t>
-      </w:r>
-      <w:r>
-        <w:rPr>
-          <w:rFonts w:ascii="Consolas" w:hAnsi="Consolas"/>
-          <w:color w:val="000000"/>
-          <w:sz w:val="20"/>
-          <w:szCs w:val="20"/>
-        </w:rPr>
-        <w:t xml:space="preserve"> ,</w:t>
-      </w:r>
-      <w:proofErr w:type="gramEnd"/>
-      <w:r>
-        <w:rPr>
-          <w:rFonts w:ascii="Consolas" w:hAnsi="Consolas"/>
-          <w:color w:val="000000"/>
-          <w:sz w:val="20"/>
-          <w:szCs w:val="20"/>
-        </w:rPr>
-        <w:t xml:space="preserve"> </w:t>
+        <w:t>dept_name</w:t>
+      </w:r>
+      <w:r>
+        <w:rPr>
+          <w:rFonts w:ascii="Consolas" w:hAnsi="Consolas"/>
+          <w:color w:val="000000"/>
+          <w:sz w:val="20"/>
+          <w:szCs w:val="20"/>
+        </w:rPr>
+        <w:t xml:space="preserve"> , </w:t>
       </w:r>
       <w:r>
         <w:rPr>
@@ -14883,38 +14225,17 @@
           <w:sz w:val="20"/>
           <w:szCs w:val="20"/>
         </w:rPr>
-        <w:t>emp_</w:t>
-      </w:r>
-      <w:proofErr w:type="gramStart"/>
-      <w:r>
-        <w:rPr>
-          <w:rFonts w:ascii="Consolas" w:hAnsi="Consolas"/>
-          <w:color w:val="006464"/>
-          <w:sz w:val="20"/>
-          <w:szCs w:val="20"/>
-        </w:rPr>
-        <w:t>name</w:t>
-      </w:r>
-      <w:r>
-        <w:rPr>
-          <w:rFonts w:ascii="Consolas" w:hAnsi="Consolas"/>
-          <w:color w:val="000000"/>
-          <w:sz w:val="20"/>
-          <w:szCs w:val="20"/>
-        </w:rPr>
-        <w:t xml:space="preserve"> ,</w:t>
-      </w:r>
-      <w:proofErr w:type="gramEnd"/>
-      <w:r>
-        <w:rPr>
-          <w:rFonts w:ascii="Consolas" w:hAnsi="Consolas"/>
-          <w:color w:val="000000"/>
-          <w:sz w:val="20"/>
-          <w:szCs w:val="20"/>
-        </w:rPr>
-        <w:t xml:space="preserve"> </w:t>
-      </w:r>
-      <w:proofErr w:type="gramStart"/>
+        <w:t>emp_name</w:t>
+      </w:r>
+      <w:r>
+        <w:rPr>
+          <w:rFonts w:ascii="Consolas" w:hAnsi="Consolas"/>
+          <w:color w:val="000000"/>
+          <w:sz w:val="20"/>
+          <w:szCs w:val="20"/>
+        </w:rPr>
+        <w:t xml:space="preserve"> , </w:t>
+      </w:r>
       <w:r>
         <w:rPr>
           <w:rFonts w:ascii="Consolas" w:hAnsi="Consolas"/>
@@ -14942,48 +14263,17 @@
           <w:sz w:val="20"/>
           <w:szCs w:val="20"/>
         </w:rPr>
-        <w:t>hire</w:t>
-      </w:r>
-      <w:proofErr w:type="gramEnd"/>
-      <w:r>
-        <w:rPr>
-          <w:rFonts w:ascii="Consolas" w:hAnsi="Consolas"/>
-          <w:color w:val="006464"/>
-          <w:sz w:val="20"/>
-          <w:szCs w:val="20"/>
-        </w:rPr>
-        <w:t>_</w:t>
-      </w:r>
-      <w:proofErr w:type="gramStart"/>
-      <w:r>
-        <w:rPr>
-          <w:rFonts w:ascii="Consolas" w:hAnsi="Consolas"/>
-          <w:color w:val="006464"/>
-          <w:sz w:val="20"/>
-          <w:szCs w:val="20"/>
-        </w:rPr>
-        <w:t>date</w:t>
-      </w:r>
-      <w:r>
-        <w:rPr>
-          <w:rFonts w:ascii="Consolas" w:hAnsi="Consolas"/>
-          <w:color w:val="000000"/>
-          <w:sz w:val="20"/>
-          <w:szCs w:val="20"/>
-        </w:rPr>
-        <w:t xml:space="preserve"> ,</w:t>
-      </w:r>
-      <w:proofErr w:type="gramEnd"/>
-      <w:r>
-        <w:rPr>
-          <w:rFonts w:ascii="Consolas" w:hAnsi="Consolas"/>
-          <w:color w:val="000000"/>
-          <w:sz w:val="20"/>
-          <w:szCs w:val="20"/>
-        </w:rPr>
-        <w:t xml:space="preserve"> </w:t>
-      </w:r>
-      <w:proofErr w:type="gramStart"/>
+        <w:t>hire_date</w:t>
+      </w:r>
+      <w:r>
+        <w:rPr>
+          <w:rFonts w:ascii="Consolas" w:hAnsi="Consolas"/>
+          <w:color w:val="000000"/>
+          <w:sz w:val="20"/>
+          <w:szCs w:val="20"/>
+        </w:rPr>
+        <w:t xml:space="preserve"> , </w:t>
+      </w:r>
       <w:r>
         <w:rPr>
           <w:rFonts w:ascii="Consolas" w:hAnsi="Consolas"/>
@@ -15013,7 +14303,6 @@
         </w:rPr>
         <w:t>salary</w:t>
       </w:r>
-      <w:proofErr w:type="gramEnd"/>
       <w:r>
         <w:rPr>
           <w:rFonts w:ascii="Consolas" w:hAnsi="Consolas"/>
@@ -15225,7 +14514,6 @@
         </w:rPr>
         <w:t xml:space="preserve"> </w:t>
       </w:r>
-      <w:proofErr w:type="gramStart"/>
       <w:r>
         <w:rPr>
           <w:rFonts w:ascii="Consolas" w:hAnsi="Consolas"/>
@@ -15253,17 +14541,7 @@
           <w:sz w:val="20"/>
           <w:szCs w:val="20"/>
         </w:rPr>
-        <w:t>dept</w:t>
-      </w:r>
-      <w:proofErr w:type="gramEnd"/>
-      <w:r>
-        <w:rPr>
-          <w:rFonts w:ascii="Consolas" w:hAnsi="Consolas"/>
-          <w:color w:val="006464"/>
-          <w:sz w:val="20"/>
-          <w:szCs w:val="20"/>
-        </w:rPr>
-        <w:t>_id</w:t>
+        <w:t>dept_id</w:t>
       </w:r>
       <w:r>
         <w:rPr>
@@ -15274,7 +14552,6 @@
         </w:rPr>
         <w:t xml:space="preserve"> = </w:t>
       </w:r>
-      <w:proofErr w:type="gramStart"/>
       <w:r>
         <w:rPr>
           <w:rFonts w:ascii="Consolas" w:hAnsi="Consolas"/>
@@ -15302,17 +14579,7 @@
           <w:sz w:val="20"/>
           <w:szCs w:val="20"/>
         </w:rPr>
-        <w:t>dept</w:t>
-      </w:r>
-      <w:proofErr w:type="gramEnd"/>
-      <w:r>
-        <w:rPr>
-          <w:rFonts w:ascii="Consolas" w:hAnsi="Consolas"/>
-          <w:color w:val="006464"/>
-          <w:sz w:val="20"/>
-          <w:szCs w:val="20"/>
-        </w:rPr>
-        <w:t>_id</w:t>
+        <w:t>dept_id</w:t>
       </w:r>
       <w:r>
         <w:rPr>
@@ -15386,7 +14653,6 @@
         </w:rPr>
         <w:t xml:space="preserve"> </w:t>
       </w:r>
-      <w:proofErr w:type="gramStart"/>
       <w:r>
         <w:rPr>
           <w:rFonts w:ascii="Consolas" w:hAnsi="Consolas"/>
@@ -15414,17 +14680,7 @@
           <w:sz w:val="20"/>
           <w:szCs w:val="20"/>
         </w:rPr>
-        <w:t>dept</w:t>
-      </w:r>
-      <w:proofErr w:type="gramEnd"/>
-      <w:r>
-        <w:rPr>
-          <w:rFonts w:ascii="Consolas" w:hAnsi="Consolas"/>
-          <w:color w:val="006464"/>
-          <w:sz w:val="20"/>
-          <w:szCs w:val="20"/>
-        </w:rPr>
-        <w:t>_id</w:t>
+        <w:t>dept_id</w:t>
       </w:r>
       <w:r>
         <w:rPr>
@@ -15520,30 +14776,14 @@
         <w:br/>
         <w:t xml:space="preserve">+ </w:t>
       </w:r>
-      <w:proofErr w:type="gramStart"/>
       <w:r>
         <w:rPr>
           <w:color w:val="EE0000"/>
         </w:rPr>
-        <w:t>PROCEDURE :</w:t>
-      </w:r>
-      <w:proofErr w:type="gramEnd"/>
-      <w:r>
-        <w:rPr>
-          <w:color w:val="EE0000"/>
-        </w:rPr>
-        <w:t xml:space="preserve"> </w:t>
-      </w:r>
-      <w:r>
-        <w:t xml:space="preserve">mục đích khi tạo ra 1 PROCEDURE là </w:t>
-      </w:r>
-      <w:proofErr w:type="gramStart"/>
-      <w:r>
-        <w:t>gì ?</w:t>
-      </w:r>
-      <w:proofErr w:type="gramEnd"/>
-      <w:r>
-        <w:t xml:space="preserve"> Làm thế nào để sử dụng PROCEDURE trong ứng dụng java.</w:t>
+        <w:t xml:space="preserve">PROCEDURE : </w:t>
+      </w:r>
+      <w:r>
+        <w:t>mục đích khi tạo ra 1 PROCEDURE là gì ? Làm thế nào để sử dụng PROCEDURE trong ứng dụng java.</w:t>
       </w:r>
     </w:p>
     <w:p/>
@@ -16017,6 +15257,19 @@
       </w:tr>
     </w:tbl>
     <w:p/>
+    <w:p/>
+    <w:p/>
+    <w:p>
+      <w:r>
+        <w:lastRenderedPageBreak/>
+        <w:t>- Dùng store vì: compile sẵn, dễ dàng sửa đổi khi thay đổi code, khi đoạn code truy vấn được gọi tới nhiều lần trong một application</w:t>
+      </w:r>
+    </w:p>
+    <w:p>
+      <w:r>
+        <w:t>-&gt; Dùng khi câu query phức tạp, nhiều bảng, nhiều điều kiện khác nhau. TH khi có thay đổi phải update, delete nhiều bảng giúp quản lý các trans dễ hơn</w:t>
+      </w:r>
+    </w:p>
     <w:sectPr>
       <w:pgSz w:w="12240" w:h="15840" w:code="1"/>
       <w:pgMar w:top="1701" w:right="1701" w:bottom="1701" w:left="1418" w:header="720" w:footer="720" w:gutter="0"/>
@@ -17213,6 +16466,7 @@
   <w:style w:type="character" w:default="1" w:styleId="DefaultParagraphFont">
     <w:name w:val="Default Paragraph Font"/>
     <w:uiPriority w:val="1"/>
+    <w:semiHidden/>
     <w:unhideWhenUsed/>
   </w:style>
   <w:style w:type="table" w:default="1" w:styleId="TableNormal">

</xml_diff>